<commit_message>
Ajusta segmentação geográfica, posicionamento manual e remove emojis quebrados no PDF
- Adiciona pins individuais para as 7 empresas isoladas fora dos 5
  clusters, e flag das 8 com endereço incompleto na planilha.
- Troca posicionamento de Advantage+ (automático) para manual (Feed +
  Stories), dado o orçamento baixo e prazo curto do teste.
- Remove emojis/setas que renderizavam como quadrado no PDF.

Co-Authored-By: Claude Sonnet 5 <noreply@anthropic.com>
Claude-Session: https://claude.ai/code/session_01GQSqEjEuqv44iBdACeUWUZ
</commit_message>
<xml_diff>
--- a/eleva/analise-campanha-compra-carteiras-imobiliarias.docx
+++ b/eleva/analise-campanha-compra-carteiras-imobiliarias.docx
@@ -111,7 +111,7 @@
           <w:sz w:val="21"/>
           <w:szCs w:val="21"/>
         </w:rPr>
-        <w:t xml:space="preserve"> clique no anúncio → conversa iniciada no WhatsApp da Eleva.</w:t>
+        <w:t xml:space="preserve"> clique no anúncio, gerando conversa iniciada no WhatsApp da Eleva.</w:t>
       </w:r>
     </w:p>
     <w:p>
@@ -981,14 +981,14 @@
           <w:sz w:val="21"/>
           <w:szCs w:val="21"/>
         </w:rPr>
-        <w:t xml:space="preserve">Cobertura total:</w:t>
-      </w:r>
-      <w:r>
-        <w:rPr>
-          <w:sz w:val="21"/>
-          <w:szCs w:val="21"/>
-        </w:rPr>
-        <w:t xml:space="preserve"> ~55 das 63 empresas listadas. As demais (~8) estão em bairros isolados sem concentração suficiente pra justificar um pin próprio — não compensa criar segmentação extra pra 1 empresa.</w:t>
+        <w:t xml:space="preserve">Cobertura pelos 5 clusters:</w:t>
+      </w:r>
+      <w:r>
+        <w:rPr>
+          <w:sz w:val="21"/>
+          <w:szCs w:val="21"/>
+        </w:rPr>
+        <w:t xml:space="preserve"> ~55 das 63 empresas listadas.</w:t>
       </w:r>
     </w:p>
     <w:p>
@@ -1002,374 +1002,14 @@
           <w:sz w:val="21"/>
           <w:szCs w:val="21"/>
         </w:rPr>
-        <w:t xml:space="preserve">Como usar no Meta Ads:</w:t>
-      </w:r>
-      <w:r>
-        <w:rPr>
-          <w:sz w:val="21"/>
-          <w:szCs w:val="21"/>
-        </w:rPr>
-        <w:t xml:space="preserve"> no conjunto de anúncios, em "Localização", adicionar cada um dos 5 pins acima (busca por bairro/endereço de referência no mapa do Gerenciador de Anúncios) com o raio indicado, em vez de selecionar "Porto Alegre" e "Canoas" como cidades inteiras.</w:t>
-      </w:r>
-    </w:p>
-    <w:p>
-      <w:pPr>
-        <w:pStyle w:val="Heading2"/>
-        <w:spacing w:after="150" w:before="300"/>
-      </w:pPr>
-      <w:r>
-        <w:t xml:space="preserve">4. Público sugerido (demografia e interesses)</w:t>
-      </w:r>
-    </w:p>
-    <w:p>
-      <w:pPr>
-        <w:pStyle w:val="ListParagraph"/>
-        <w:numPr>
-          <w:ilvl w:val="0"/>
-          <w:numId w:val="1"/>
-        </w:numPr>
-        <w:spacing w:after="80"/>
-      </w:pPr>
-      <w:r>
-        <w:rPr>
-          <w:b/>
-          <w:bCs/>
-          <w:sz w:val="21"/>
-          <w:szCs w:val="21"/>
-        </w:rPr>
-        <w:t xml:space="preserve">Localização:</w:t>
-      </w:r>
-      <w:r>
-        <w:rPr>
-          <w:sz w:val="21"/>
-          <w:szCs w:val="21"/>
-        </w:rPr>
-        <w:t xml:space="preserve"> os 5 clusters da seção 3</w:t>
-      </w:r>
-    </w:p>
-    <w:p>
-      <w:pPr>
-        <w:pStyle w:val="ListParagraph"/>
-        <w:numPr>
-          <w:ilvl w:val="0"/>
-          <w:numId w:val="1"/>
-        </w:numPr>
-        <w:spacing w:after="80"/>
-      </w:pPr>
-      <w:r>
-        <w:rPr>
-          <w:b/>
-          <w:bCs/>
-          <w:sz w:val="21"/>
-          <w:szCs w:val="21"/>
-        </w:rPr>
-        <w:t xml:space="preserve">Idade:</w:t>
-      </w:r>
-      <w:r>
-        <w:rPr>
-          <w:sz w:val="21"/>
-          <w:szCs w:val="21"/>
-        </w:rPr>
-        <w:t xml:space="preserve"> 30–65 anos</w:t>
-      </w:r>
-    </w:p>
-    <w:p>
-      <w:pPr>
-        <w:pStyle w:val="ListParagraph"/>
-        <w:numPr>
-          <w:ilvl w:val="0"/>
-          <w:numId w:val="1"/>
-        </w:numPr>
-        <w:spacing w:after="80"/>
-      </w:pPr>
-      <w:r>
-        <w:rPr>
-          <w:b/>
-          <w:bCs/>
-          <w:sz w:val="21"/>
-          <w:szCs w:val="21"/>
-        </w:rPr>
-        <w:t xml:space="preserve">Gênero:</w:t>
-      </w:r>
-      <w:r>
-        <w:rPr>
-          <w:sz w:val="21"/>
-          <w:szCs w:val="21"/>
-        </w:rPr>
-        <w:t xml:space="preserve"> todos</w:t>
-      </w:r>
-    </w:p>
-    <w:p>
-      <w:pPr>
-        <w:pStyle w:val="ListParagraph"/>
-        <w:numPr>
-          <w:ilvl w:val="0"/>
-          <w:numId w:val="1"/>
-        </w:numPr>
-        <w:spacing w:after="80"/>
-      </w:pPr>
-      <w:r>
-        <w:rPr>
-          <w:b/>
-          <w:bCs/>
-          <w:sz w:val="21"/>
-          <w:szCs w:val="21"/>
-        </w:rPr>
-        <w:t xml:space="preserve">Interesses (segmentação detalhada manual, combinados com "OU" — sem estreitar):</w:t>
-      </w:r>
-      <w:r>
-        <w:rPr>
-          <w:sz w:val="21"/>
-          <w:szCs w:val="21"/>
-        </w:rPr>
-        <w:t xml:space="preserve"> Mercado imobiliário, Corretagem de imóveis, Gestão de propriedades, Investimento imobiliário, Administração de condomínios</w:t>
-      </w:r>
-    </w:p>
-    <w:p>
-      <w:pPr>
-        <w:pStyle w:val="ListParagraph"/>
-        <w:numPr>
-          <w:ilvl w:val="0"/>
-          <w:numId w:val="1"/>
-        </w:numPr>
-        <w:spacing w:after="80"/>
-      </w:pPr>
-      <w:r>
-        <w:rPr>
-          <w:b/>
-          <w:bCs/>
-          <w:sz w:val="21"/>
-          <w:szCs w:val="21"/>
-        </w:rPr>
-        <w:t xml:space="preserve">Expansão de detalhamento de público:</w:t>
-      </w:r>
-      <w:r>
-        <w:rPr>
-          <w:sz w:val="21"/>
-          <w:szCs w:val="21"/>
-        </w:rPr>
-        <w:t xml:space="preserve"> </w:t>
-      </w:r>
-      <w:r>
-        <w:rPr>
-          <w:b/>
-          <w:bCs/>
-          <w:sz w:val="21"/>
-          <w:szCs w:val="21"/>
-        </w:rPr>
-        <w:t xml:space="preserve">desativada</w:t>
-      </w:r>
-      <w:r>
-        <w:rPr>
-          <w:sz w:val="21"/>
-          <w:szCs w:val="21"/>
-        </w:rPr>
-        <w:t xml:space="preserve"> — com orçamento de R$50/dia e público já hiperlocal, deixar o Meta "expandir" pra fora dos interesses definidos arrisca gastar verba testando gente fora do perfil antes de aprender.</w:t>
-      </w:r>
-    </w:p>
-    <w:p>
-      <w:pPr>
-        <w:pStyle w:val="ListParagraph"/>
-        <w:numPr>
-          <w:ilvl w:val="0"/>
-          <w:numId w:val="1"/>
-        </w:numPr>
-        <w:spacing w:after="80"/>
-      </w:pPr>
-      <w:r>
-        <w:rPr>
-          <w:b/>
-          <w:bCs/>
-          <w:sz w:val="21"/>
-          <w:szCs w:val="21"/>
-        </w:rPr>
-        <w:t xml:space="preserve">Posicionamento:</w:t>
-      </w:r>
-      <w:r>
-        <w:rPr>
-          <w:sz w:val="21"/>
-          <w:szCs w:val="21"/>
-        </w:rPr>
-        <w:t xml:space="preserve"> Advantage+ (automático, só decide onde o anúncio aparece — Feed, Stories, Reels — não expande quem vê)</w:t>
-      </w:r>
-    </w:p>
-    <w:p>
-      <w:pPr>
-        <w:spacing w:after="160"/>
-      </w:pPr>
-      <w:r>
-        <w:rPr>
-          <w:b/>
-          <w:bCs/>
-          <w:sz w:val="21"/>
-          <w:szCs w:val="21"/>
-        </w:rPr>
-        <w:t xml:space="preserve">Reforço no criativo/legenda:</w:t>
-      </w:r>
-      <w:r>
-        <w:rPr>
-          <w:sz w:val="21"/>
-          <w:szCs w:val="21"/>
-        </w:rPr>
-        <w:t xml:space="preserve"> usar termos como "dono de imobiliária", "administradora de aluguéis e condomínios", "carteira de imóveis" na legenda, pra quem não se identificar simplesmente ignorar o anúncio — essa é a segmentação "de verdade" nesse caso.</w:t>
-      </w:r>
-    </w:p>
-    <w:p>
-      <w:pPr>
-        <w:pStyle w:val="Heading2"/>
-        <w:spacing w:after="150" w:before="300"/>
-      </w:pPr>
-      <w:r>
-        <w:t xml:space="preserve">5. Cronograma e orçamento do teste</w:t>
-      </w:r>
-    </w:p>
-    <w:p>
-      <w:pPr>
-        <w:pStyle w:val="ListParagraph"/>
-        <w:numPr>
-          <w:ilvl w:val="0"/>
-          <w:numId w:val="1"/>
-        </w:numPr>
-        <w:spacing w:after="80"/>
-      </w:pPr>
-      <w:r>
-        <w:rPr>
-          <w:b/>
-          <w:bCs/>
-          <w:sz w:val="21"/>
-          <w:szCs w:val="21"/>
-        </w:rPr>
-        <w:t xml:space="preserve">Duração:</w:t>
-      </w:r>
-      <w:r>
-        <w:rPr>
-          <w:sz w:val="21"/>
-          <w:szCs w:val="21"/>
-        </w:rPr>
-        <w:t xml:space="preserve"> 15 dias corridos</w:t>
-      </w:r>
-    </w:p>
-    <w:p>
-      <w:pPr>
-        <w:pStyle w:val="ListParagraph"/>
-        <w:numPr>
-          <w:ilvl w:val="0"/>
-          <w:numId w:val="1"/>
-        </w:numPr>
-        <w:spacing w:after="80"/>
-      </w:pPr>
-      <w:r>
-        <w:rPr>
-          <w:b/>
-          <w:bCs/>
-          <w:sz w:val="21"/>
-          <w:szCs w:val="21"/>
-        </w:rPr>
-        <w:t xml:space="preserve">Orçamento diário:</w:t>
-      </w:r>
-      <w:r>
-        <w:rPr>
-          <w:sz w:val="21"/>
-          <w:szCs w:val="21"/>
-        </w:rPr>
-        <w:t xml:space="preserve"> R$50</w:t>
-      </w:r>
-    </w:p>
-    <w:p>
-      <w:pPr>
-        <w:pStyle w:val="ListParagraph"/>
-        <w:numPr>
-          <w:ilvl w:val="0"/>
-          <w:numId w:val="1"/>
-        </w:numPr>
-        <w:spacing w:after="80"/>
-      </w:pPr>
-      <w:r>
-        <w:rPr>
-          <w:b/>
-          <w:bCs/>
-          <w:sz w:val="21"/>
-          <w:szCs w:val="21"/>
-        </w:rPr>
-        <w:t xml:space="preserve">Orçamento total do teste:</w:t>
-      </w:r>
-      <w:r>
-        <w:rPr>
-          <w:sz w:val="21"/>
-          <w:szCs w:val="21"/>
-        </w:rPr>
-        <w:t xml:space="preserve"> R$750</w:t>
-      </w:r>
-    </w:p>
-    <w:p>
-      <w:pPr>
-        <w:pStyle w:val="ListParagraph"/>
-        <w:numPr>
-          <w:ilvl w:val="0"/>
-          <w:numId w:val="1"/>
-        </w:numPr>
-        <w:spacing w:after="80"/>
-      </w:pPr>
-      <w:r>
-        <w:rPr>
-          <w:b/>
-          <w:bCs/>
-          <w:sz w:val="21"/>
-          <w:szCs w:val="21"/>
-        </w:rPr>
-        <w:t xml:space="preserve">Critério de decisão ao final:</w:t>
-      </w:r>
-      <w:r>
-        <w:rPr>
-          <w:sz w:val="21"/>
-          <w:szCs w:val="21"/>
-        </w:rPr>
-        <w:t xml:space="preserve"> se o custo por conversa iniciada estiver dentro do razoável (seção 6) e/ou já surgir pelo menos 1 conversa qualificada (imobiliária real, carteira real), aumentar o orçamento. Se não houver nenhuma conversa qualificada em 15 dias, revisar público e/ou criativo antes de aumentar verba.</w:t>
-      </w:r>
-    </w:p>
-    <w:p>
-      <w:pPr>
-        <w:pStyle w:val="Heading2"/>
-        <w:spacing w:after="150" w:before="300"/>
-      </w:pPr>
-      <w:r>
-        <w:t xml:space="preserve">6. Projeção de métricas (cenários, acumulado dos 15 dias) — ⚠️ estimativa, não dado real</w:t>
-      </w:r>
-    </w:p>
-    <w:p>
-      <w:pPr>
-        <w:spacing w:after="160"/>
-      </w:pPr>
-      <w:r>
-        <w:rPr>
-          <w:b/>
-          <w:bCs/>
-          <w:sz w:val="21"/>
-          <w:szCs w:val="21"/>
-        </w:rPr>
-        <w:t xml:space="preserve">Premissa:</w:t>
-      </w:r>
-      <w:r>
-        <w:rPr>
-          <w:sz w:val="21"/>
-          <w:szCs w:val="21"/>
-        </w:rPr>
-        <w:t xml:space="preserve"> sem CPM histórico desse público específico (por não haver dado da campanha anterior nesta BM), a projeção usa benchmark geral de Meta Ads B2B no Brasil, ajustado pra cima pela restrição geográfica forte (público pequeno tende a aumentar CPM), e pra baixo pela segmentação por cluster (seção 3), que deve melhorar a eficiência frente a segmentar a cidade inteira.</w:t>
-      </w:r>
-    </w:p>
-    <w:p>
-      <w:pPr>
-        <w:spacing w:after="80"/>
-      </w:pPr>
-      <w:r>
-        <w:rPr>
-          <w:i/>
-          <w:iCs/>
-          <w:color w:val="555555"/>
-          <w:sz w:val="18"/>
-          <w:szCs w:val="18"/>
-        </w:rPr>
-        <w:t xml:space="preserve">Todos os números abaixo são o total acumulado dos 15 dias de campanha (R$750 no total, não por dia).</w:t>
+        <w:t xml:space="preserve">Pins individuais adicionais (empresas fora dos 5 clusters):</w:t>
+      </w:r>
+      <w:r>
+        <w:rPr>
+          <w:sz w:val="21"/>
+          <w:szCs w:val="21"/>
+        </w:rPr>
+        <w:t xml:space="preserve"> como não é trabalhoso adicionar mais pins e a ideia é explorar todas as possibilidades, as empresas que ficam fora dos clusters acima recebem um pin próprio, direto no endereço, com raio pequeno (~1 km):</w:t>
       </w:r>
     </w:p>
     <w:tbl>
@@ -1405,7 +1045,7 @@
                 <w:sz w:val="19"/>
                 <w:szCs w:val="19"/>
               </w:rPr>
-              <w:t xml:space="preserve">Métrica</w:t>
+              <w:t xml:space="preserve">Empresa</w:t>
             </w:r>
           </w:p>
         </w:tc>
@@ -1423,7 +1063,7 @@
                 <w:sz w:val="19"/>
                 <w:szCs w:val="19"/>
               </w:rPr>
-              <w:t xml:space="preserve">Conservador</w:t>
+              <w:t xml:space="preserve">Cidade</w:t>
             </w:r>
           </w:p>
         </w:tc>
@@ -1441,7 +1081,7 @@
                 <w:sz w:val="19"/>
                 <w:szCs w:val="19"/>
               </w:rPr>
-              <w:t xml:space="preserve">Realista</w:t>
+              <w:t xml:space="preserve">Endereço</w:t>
             </w:r>
           </w:p>
         </w:tc>
@@ -1459,7 +1099,7 @@
                 <w:sz w:val="19"/>
                 <w:szCs w:val="19"/>
               </w:rPr>
-              <w:t xml:space="preserve">Otimista</w:t>
+              <w:t xml:space="preserve">Bairro</w:t>
             </w:r>
           </w:p>
         </w:tc>
@@ -1478,58 +1118,58 @@
                 <w:sz w:val="19"/>
                 <w:szCs w:val="19"/>
               </w:rPr>
-              <w:t xml:space="preserve">CPM (custo por mil impressões)</w:t>
-            </w:r>
-          </w:p>
-        </w:tc>
-        <w:tc>
-          <w:tcPr>
-            <w:tcW w:type="dxa" w:w="2256"/>
-          </w:tcPr>
-          <w:p>
-            <w:r>
-              <w:rPr>
-                <w:b w:val="false"/>
-                <w:bCs w:val="false"/>
-                <w:color w:val="000000"/>
-                <w:sz w:val="19"/>
-                <w:szCs w:val="19"/>
-              </w:rPr>
-              <w:t xml:space="preserve">R$35</w:t>
-            </w:r>
-          </w:p>
-        </w:tc>
-        <w:tc>
-          <w:tcPr>
-            <w:tcW w:type="dxa" w:w="2256"/>
-          </w:tcPr>
-          <w:p>
-            <w:r>
-              <w:rPr>
-                <w:b w:val="false"/>
-                <w:bCs w:val="false"/>
-                <w:color w:val="000000"/>
-                <w:sz w:val="19"/>
-                <w:szCs w:val="19"/>
-              </w:rPr>
-              <w:t xml:space="preserve">R$25</w:t>
-            </w:r>
-          </w:p>
-        </w:tc>
-        <w:tc>
-          <w:tcPr>
-            <w:tcW w:type="dxa" w:w="2256"/>
-          </w:tcPr>
-          <w:p>
-            <w:r>
-              <w:rPr>
-                <w:b w:val="false"/>
-                <w:bCs w:val="false"/>
-                <w:color w:val="000000"/>
-                <w:sz w:val="19"/>
-                <w:szCs w:val="19"/>
-              </w:rPr>
-              <w:t xml:space="preserve">R$15</w:t>
+              <w:t xml:space="preserve">Alfa City Adm. de Condomínios</w:t>
+            </w:r>
+          </w:p>
+        </w:tc>
+        <w:tc>
+          <w:tcPr>
+            <w:tcW w:type="dxa" w:w="2256"/>
+          </w:tcPr>
+          <w:p>
+            <w:r>
+              <w:rPr>
+                <w:b w:val="false"/>
+                <w:bCs w:val="false"/>
+                <w:color w:val="000000"/>
+                <w:sz w:val="19"/>
+                <w:szCs w:val="19"/>
+              </w:rPr>
+              <w:t xml:space="preserve">Porto Alegre</w:t>
+            </w:r>
+          </w:p>
+        </w:tc>
+        <w:tc>
+          <w:tcPr>
+            <w:tcW w:type="dxa" w:w="2256"/>
+          </w:tcPr>
+          <w:p>
+            <w:r>
+              <w:rPr>
+                <w:b w:val="false"/>
+                <w:bCs w:val="false"/>
+                <w:color w:val="000000"/>
+                <w:sz w:val="19"/>
+                <w:szCs w:val="19"/>
+              </w:rPr>
+              <w:t xml:space="preserve">Av. Assis Brasil, 4550</w:t>
+            </w:r>
+          </w:p>
+        </w:tc>
+        <w:tc>
+          <w:tcPr>
+            <w:tcW w:type="dxa" w:w="2256"/>
+          </w:tcPr>
+          <w:p>
+            <w:r>
+              <w:rPr>
+                <w:b w:val="false"/>
+                <w:bCs w:val="false"/>
+                <w:color w:val="000000"/>
+                <w:sz w:val="19"/>
+                <w:szCs w:val="19"/>
+              </w:rPr>
+              <w:t xml:space="preserve">São Sebastião</w:t>
             </w:r>
           </w:p>
         </w:tc>
@@ -1548,58 +1188,58 @@
                 <w:sz w:val="19"/>
                 <w:szCs w:val="19"/>
               </w:rPr>
-              <w:t xml:space="preserve">Impressões (total, 15 dias)</w:t>
-            </w:r>
-          </w:p>
-        </w:tc>
-        <w:tc>
-          <w:tcPr>
-            <w:tcW w:type="dxa" w:w="2256"/>
-          </w:tcPr>
-          <w:p>
-            <w:r>
-              <w:rPr>
-                <w:b w:val="false"/>
-                <w:bCs w:val="false"/>
-                <w:color w:val="000000"/>
-                <w:sz w:val="19"/>
-                <w:szCs w:val="19"/>
-              </w:rPr>
-              <w:t xml:space="preserve">~21.400</w:t>
-            </w:r>
-          </w:p>
-        </w:tc>
-        <w:tc>
-          <w:tcPr>
-            <w:tcW w:type="dxa" w:w="2256"/>
-          </w:tcPr>
-          <w:p>
-            <w:r>
-              <w:rPr>
-                <w:b w:val="false"/>
-                <w:bCs w:val="false"/>
-                <w:color w:val="000000"/>
-                <w:sz w:val="19"/>
-                <w:szCs w:val="19"/>
-              </w:rPr>
-              <w:t xml:space="preserve">~30.000</w:t>
-            </w:r>
-          </w:p>
-        </w:tc>
-        <w:tc>
-          <w:tcPr>
-            <w:tcW w:type="dxa" w:w="2256"/>
-          </w:tcPr>
-          <w:p>
-            <w:r>
-              <w:rPr>
-                <w:b w:val="false"/>
-                <w:bCs w:val="false"/>
-                <w:color w:val="000000"/>
-                <w:sz w:val="19"/>
-                <w:szCs w:val="19"/>
-              </w:rPr>
-              <w:t xml:space="preserve">~50.000</w:t>
+              <w:t xml:space="preserve">Innove Imóveis e Seguros</w:t>
+            </w:r>
+          </w:p>
+        </w:tc>
+        <w:tc>
+          <w:tcPr>
+            <w:tcW w:type="dxa" w:w="2256"/>
+          </w:tcPr>
+          <w:p>
+            <w:r>
+              <w:rPr>
+                <w:b w:val="false"/>
+                <w:bCs w:val="false"/>
+                <w:color w:val="000000"/>
+                <w:sz w:val="19"/>
+                <w:szCs w:val="19"/>
+              </w:rPr>
+              <w:t xml:space="preserve">Porto Alegre</w:t>
+            </w:r>
+          </w:p>
+        </w:tc>
+        <w:tc>
+          <w:tcPr>
+            <w:tcW w:type="dxa" w:w="2256"/>
+          </w:tcPr>
+          <w:p>
+            <w:r>
+              <w:rPr>
+                <w:b w:val="false"/>
+                <w:bCs w:val="false"/>
+                <w:color w:val="000000"/>
+                <w:sz w:val="19"/>
+                <w:szCs w:val="19"/>
+              </w:rPr>
+              <w:t xml:space="preserve">Av. Bento Gonçalves</w:t>
+            </w:r>
+          </w:p>
+        </w:tc>
+        <w:tc>
+          <w:tcPr>
+            <w:tcW w:type="dxa" w:w="2256"/>
+          </w:tcPr>
+          <w:p>
+            <w:r>
+              <w:rPr>
+                <w:b w:val="false"/>
+                <w:bCs w:val="false"/>
+                <w:color w:val="000000"/>
+                <w:sz w:val="19"/>
+                <w:szCs w:val="19"/>
+              </w:rPr>
+              <w:t xml:space="preserve">Partenon</w:t>
             </w:r>
           </w:p>
         </w:tc>
@@ -1618,58 +1258,58 @@
                 <w:sz w:val="19"/>
                 <w:szCs w:val="19"/>
               </w:rPr>
-              <w:t xml:space="preserve">Frequência estimada</w:t>
-            </w:r>
-          </w:p>
-        </w:tc>
-        <w:tc>
-          <w:tcPr>
-            <w:tcW w:type="dxa" w:w="2256"/>
-          </w:tcPr>
-          <w:p>
-            <w:r>
-              <w:rPr>
-                <w:b w:val="false"/>
-                <w:bCs w:val="false"/>
-                <w:color w:val="000000"/>
-                <w:sz w:val="19"/>
-                <w:szCs w:val="19"/>
-              </w:rPr>
-              <w:t xml:space="preserve">2,5</w:t>
-            </w:r>
-          </w:p>
-        </w:tc>
-        <w:tc>
-          <w:tcPr>
-            <w:tcW w:type="dxa" w:w="2256"/>
-          </w:tcPr>
-          <w:p>
-            <w:r>
-              <w:rPr>
-                <w:b w:val="false"/>
-                <w:bCs w:val="false"/>
-                <w:color w:val="000000"/>
-                <w:sz w:val="19"/>
-                <w:szCs w:val="19"/>
-              </w:rPr>
-              <w:t xml:space="preserve">2,0</w:t>
-            </w:r>
-          </w:p>
-        </w:tc>
-        <w:tc>
-          <w:tcPr>
-            <w:tcW w:type="dxa" w:w="2256"/>
-          </w:tcPr>
-          <w:p>
-            <w:r>
-              <w:rPr>
-                <w:b w:val="false"/>
-                <w:bCs w:val="false"/>
-                <w:color w:val="000000"/>
-                <w:sz w:val="19"/>
-                <w:szCs w:val="19"/>
-              </w:rPr>
-              <w:t xml:space="preserve">1,6</w:t>
+              <w:t xml:space="preserve">Imobiliária Farrapos</w:t>
+            </w:r>
+          </w:p>
+        </w:tc>
+        <w:tc>
+          <w:tcPr>
+            <w:tcW w:type="dxa" w:w="2256"/>
+          </w:tcPr>
+          <w:p>
+            <w:r>
+              <w:rPr>
+                <w:b w:val="false"/>
+                <w:bCs w:val="false"/>
+                <w:color w:val="000000"/>
+                <w:sz w:val="19"/>
+                <w:szCs w:val="19"/>
+              </w:rPr>
+              <w:t xml:space="preserve">Porto Alegre</w:t>
+            </w:r>
+          </w:p>
+        </w:tc>
+        <w:tc>
+          <w:tcPr>
+            <w:tcW w:type="dxa" w:w="2256"/>
+          </w:tcPr>
+          <w:p>
+            <w:r>
+              <w:rPr>
+                <w:b w:val="false"/>
+                <w:bCs w:val="false"/>
+                <w:color w:val="000000"/>
+                <w:sz w:val="19"/>
+                <w:szCs w:val="19"/>
+              </w:rPr>
+              <w:t xml:space="preserve">Rua Conde de Porto Alegre</w:t>
+            </w:r>
+          </w:p>
+        </w:tc>
+        <w:tc>
+          <w:tcPr>
+            <w:tcW w:type="dxa" w:w="2256"/>
+          </w:tcPr>
+          <w:p>
+            <w:r>
+              <w:rPr>
+                <w:b w:val="false"/>
+                <w:bCs w:val="false"/>
+                <w:color w:val="000000"/>
+                <w:sz w:val="19"/>
+                <w:szCs w:val="19"/>
+              </w:rPr>
+              <w:t xml:space="preserve">Navegantes</w:t>
             </w:r>
           </w:p>
         </w:tc>
@@ -1688,58 +1328,58 @@
                 <w:sz w:val="19"/>
                 <w:szCs w:val="19"/>
               </w:rPr>
-              <w:t xml:space="preserve">Alcance estimado</w:t>
-            </w:r>
-          </w:p>
-        </w:tc>
-        <w:tc>
-          <w:tcPr>
-            <w:tcW w:type="dxa" w:w="2256"/>
-          </w:tcPr>
-          <w:p>
-            <w:r>
-              <w:rPr>
-                <w:b w:val="false"/>
-                <w:bCs w:val="false"/>
-                <w:color w:val="000000"/>
-                <w:sz w:val="19"/>
-                <w:szCs w:val="19"/>
-              </w:rPr>
-              <w:t xml:space="preserve">~8.500</w:t>
-            </w:r>
-          </w:p>
-        </w:tc>
-        <w:tc>
-          <w:tcPr>
-            <w:tcW w:type="dxa" w:w="2256"/>
-          </w:tcPr>
-          <w:p>
-            <w:r>
-              <w:rPr>
-                <w:b w:val="false"/>
-                <w:bCs w:val="false"/>
-                <w:color w:val="000000"/>
-                <w:sz w:val="19"/>
-                <w:szCs w:val="19"/>
-              </w:rPr>
-              <w:t xml:space="preserve">~15.000</w:t>
-            </w:r>
-          </w:p>
-        </w:tc>
-        <w:tc>
-          <w:tcPr>
-            <w:tcW w:type="dxa" w:w="2256"/>
-          </w:tcPr>
-          <w:p>
-            <w:r>
-              <w:rPr>
-                <w:b w:val="false"/>
-                <w:bCs w:val="false"/>
-                <w:color w:val="000000"/>
-                <w:sz w:val="19"/>
-                <w:szCs w:val="19"/>
-              </w:rPr>
-              <w:t xml:space="preserve">~31.000</w:t>
+              <w:t xml:space="preserve">Talla Adm. de Condomínios</w:t>
+            </w:r>
+          </w:p>
+        </w:tc>
+        <w:tc>
+          <w:tcPr>
+            <w:tcW w:type="dxa" w:w="2256"/>
+          </w:tcPr>
+          <w:p>
+            <w:r>
+              <w:rPr>
+                <w:b w:val="false"/>
+                <w:bCs w:val="false"/>
+                <w:color w:val="000000"/>
+                <w:sz w:val="19"/>
+                <w:szCs w:val="19"/>
+              </w:rPr>
+              <w:t xml:space="preserve">Porto Alegre</w:t>
+            </w:r>
+          </w:p>
+        </w:tc>
+        <w:tc>
+          <w:tcPr>
+            <w:tcW w:type="dxa" w:w="2256"/>
+          </w:tcPr>
+          <w:p>
+            <w:r>
+              <w:rPr>
+                <w:b w:val="false"/>
+                <w:bCs w:val="false"/>
+                <w:color w:val="000000"/>
+                <w:sz w:val="19"/>
+                <w:szCs w:val="19"/>
+              </w:rPr>
+              <w:t xml:space="preserve">Av. Protásio Alves, 1880</w:t>
+            </w:r>
+          </w:p>
+        </w:tc>
+        <w:tc>
+          <w:tcPr>
+            <w:tcW w:type="dxa" w:w="2256"/>
+          </w:tcPr>
+          <w:p>
+            <w:r>
+              <w:rPr>
+                <w:b w:val="false"/>
+                <w:bCs w:val="false"/>
+                <w:color w:val="000000"/>
+                <w:sz w:val="19"/>
+                <w:szCs w:val="19"/>
+              </w:rPr>
+              <w:t xml:space="preserve">Petrópolis</w:t>
             </w:r>
           </w:p>
         </w:tc>
@@ -1758,58 +1398,58 @@
                 <w:sz w:val="19"/>
                 <w:szCs w:val="19"/>
               </w:rPr>
-              <w:t xml:space="preserve">CTR (todos os cliques)</w:t>
-            </w:r>
-          </w:p>
-        </w:tc>
-        <w:tc>
-          <w:tcPr>
-            <w:tcW w:type="dxa" w:w="2256"/>
-          </w:tcPr>
-          <w:p>
-            <w:r>
-              <w:rPr>
-                <w:b w:val="false"/>
-                <w:bCs w:val="false"/>
-                <w:color w:val="000000"/>
-                <w:sz w:val="19"/>
-                <w:szCs w:val="19"/>
-              </w:rPr>
-              <w:t xml:space="preserve">1,0%</w:t>
-            </w:r>
-          </w:p>
-        </w:tc>
-        <w:tc>
-          <w:tcPr>
-            <w:tcW w:type="dxa" w:w="2256"/>
-          </w:tcPr>
-          <w:p>
-            <w:r>
-              <w:rPr>
-                <w:b w:val="false"/>
-                <w:bCs w:val="false"/>
-                <w:color w:val="000000"/>
-                <w:sz w:val="19"/>
-                <w:szCs w:val="19"/>
-              </w:rPr>
-              <w:t xml:space="preserve">1,8%</w:t>
-            </w:r>
-          </w:p>
-        </w:tc>
-        <w:tc>
-          <w:tcPr>
-            <w:tcW w:type="dxa" w:w="2256"/>
-          </w:tcPr>
-          <w:p>
-            <w:r>
-              <w:rPr>
-                <w:b w:val="false"/>
-                <w:bCs w:val="false"/>
-                <w:color w:val="000000"/>
-                <w:sz w:val="19"/>
-                <w:szCs w:val="19"/>
-              </w:rPr>
-              <w:t xml:space="preserve">2,5%</w:t>
+              <w:t xml:space="preserve">Inovar Gestão Imobiliária</w:t>
+            </w:r>
+          </w:p>
+        </w:tc>
+        <w:tc>
+          <w:tcPr>
+            <w:tcW w:type="dxa" w:w="2256"/>
+          </w:tcPr>
+          <w:p>
+            <w:r>
+              <w:rPr>
+                <w:b w:val="false"/>
+                <w:bCs w:val="false"/>
+                <w:color w:val="000000"/>
+                <w:sz w:val="19"/>
+                <w:szCs w:val="19"/>
+              </w:rPr>
+              <w:t xml:space="preserve">Canoas</w:t>
+            </w:r>
+          </w:p>
+        </w:tc>
+        <w:tc>
+          <w:tcPr>
+            <w:tcW w:type="dxa" w:w="2256"/>
+          </w:tcPr>
+          <w:p>
+            <w:r>
+              <w:rPr>
+                <w:b w:val="false"/>
+                <w:bCs w:val="false"/>
+                <w:color w:val="000000"/>
+                <w:sz w:val="19"/>
+                <w:szCs w:val="19"/>
+              </w:rPr>
+              <w:t xml:space="preserve">Rua Lajeado, 1621</w:t>
+            </w:r>
+          </w:p>
+        </w:tc>
+        <w:tc>
+          <w:tcPr>
+            <w:tcW w:type="dxa" w:w="2256"/>
+          </w:tcPr>
+          <w:p>
+            <w:r>
+              <w:rPr>
+                <w:b w:val="false"/>
+                <w:bCs w:val="false"/>
+                <w:color w:val="000000"/>
+                <w:sz w:val="19"/>
+                <w:szCs w:val="19"/>
+              </w:rPr>
+              <w:t xml:space="preserve">Niterói</w:t>
             </w:r>
           </w:p>
         </w:tc>
@@ -1828,58 +1468,58 @@
                 <w:sz w:val="19"/>
                 <w:szCs w:val="19"/>
               </w:rPr>
-              <w:t xml:space="preserve">Cliques estimados (total)</w:t>
-            </w:r>
-          </w:p>
-        </w:tc>
-        <w:tc>
-          <w:tcPr>
-            <w:tcW w:type="dxa" w:w="2256"/>
-          </w:tcPr>
-          <w:p>
-            <w:r>
-              <w:rPr>
-                <w:b w:val="false"/>
-                <w:bCs w:val="false"/>
-                <w:color w:val="000000"/>
-                <w:sz w:val="19"/>
-                <w:szCs w:val="19"/>
-              </w:rPr>
-              <w:t xml:space="preserve">~214</w:t>
-            </w:r>
-          </w:p>
-        </w:tc>
-        <w:tc>
-          <w:tcPr>
-            <w:tcW w:type="dxa" w:w="2256"/>
-          </w:tcPr>
-          <w:p>
-            <w:r>
-              <w:rPr>
-                <w:b w:val="false"/>
-                <w:bCs w:val="false"/>
-                <w:color w:val="000000"/>
-                <w:sz w:val="19"/>
-                <w:szCs w:val="19"/>
-              </w:rPr>
-              <w:t xml:space="preserve">~540</w:t>
-            </w:r>
-          </w:p>
-        </w:tc>
-        <w:tc>
-          <w:tcPr>
-            <w:tcW w:type="dxa" w:w="2256"/>
-          </w:tcPr>
-          <w:p>
-            <w:r>
-              <w:rPr>
-                <w:b w:val="false"/>
-                <w:bCs w:val="false"/>
-                <w:color w:val="000000"/>
-                <w:sz w:val="19"/>
-                <w:szCs w:val="19"/>
-              </w:rPr>
-              <w:t xml:space="preserve">~1.250</w:t>
+              <w:t xml:space="preserve">R2 Síndicos Profissionais</w:t>
+            </w:r>
+          </w:p>
+        </w:tc>
+        <w:tc>
+          <w:tcPr>
+            <w:tcW w:type="dxa" w:w="2256"/>
+          </w:tcPr>
+          <w:p>
+            <w:r>
+              <w:rPr>
+                <w:b w:val="false"/>
+                <w:bCs w:val="false"/>
+                <w:color w:val="000000"/>
+                <w:sz w:val="19"/>
+                <w:szCs w:val="19"/>
+              </w:rPr>
+              <w:t xml:space="preserve">Canoas</w:t>
+            </w:r>
+          </w:p>
+        </w:tc>
+        <w:tc>
+          <w:tcPr>
+            <w:tcW w:type="dxa" w:w="2256"/>
+          </w:tcPr>
+          <w:p>
+            <w:r>
+              <w:rPr>
+                <w:b w:val="false"/>
+                <w:bCs w:val="false"/>
+                <w:color w:val="000000"/>
+                <w:sz w:val="19"/>
+                <w:szCs w:val="19"/>
+              </w:rPr>
+              <w:t xml:space="preserve">Rua Paes Lemes, 715 Sl 01</w:t>
+            </w:r>
+          </w:p>
+        </w:tc>
+        <w:tc>
+          <w:tcPr>
+            <w:tcW w:type="dxa" w:w="2256"/>
+          </w:tcPr>
+          <w:p>
+            <w:r>
+              <w:rPr>
+                <w:b w:val="false"/>
+                <w:bCs w:val="false"/>
+                <w:color w:val="000000"/>
+                <w:sz w:val="19"/>
+                <w:szCs w:val="19"/>
+              </w:rPr>
+              <w:t xml:space="preserve">Rio Branco (Canoas)</w:t>
             </w:r>
           </w:p>
         </w:tc>
@@ -1898,128 +1538,58 @@
                 <w:sz w:val="19"/>
                 <w:szCs w:val="19"/>
               </w:rPr>
-              <w:t xml:space="preserve">Custo por conversa iniciada (WhatsApp)</w:t>
-            </w:r>
-          </w:p>
-        </w:tc>
-        <w:tc>
-          <w:tcPr>
-            <w:tcW w:type="dxa" w:w="2256"/>
-          </w:tcPr>
-          <w:p>
-            <w:r>
-              <w:rPr>
-                <w:b w:val="false"/>
-                <w:bCs w:val="false"/>
-                <w:color w:val="000000"/>
-                <w:sz w:val="19"/>
-                <w:szCs w:val="19"/>
-              </w:rPr>
-              <w:t xml:space="preserve">R$35</w:t>
-            </w:r>
-          </w:p>
-        </w:tc>
-        <w:tc>
-          <w:tcPr>
-            <w:tcW w:type="dxa" w:w="2256"/>
-          </w:tcPr>
-          <w:p>
-            <w:r>
-              <w:rPr>
-                <w:b w:val="false"/>
-                <w:bCs w:val="false"/>
-                <w:color w:val="000000"/>
-                <w:sz w:val="19"/>
-                <w:szCs w:val="19"/>
-              </w:rPr>
-              <w:t xml:space="preserve">R$22</w:t>
-            </w:r>
-          </w:p>
-        </w:tc>
-        <w:tc>
-          <w:tcPr>
-            <w:tcW w:type="dxa" w:w="2256"/>
-          </w:tcPr>
-          <w:p>
-            <w:r>
-              <w:rPr>
-                <w:b w:val="false"/>
-                <w:bCs w:val="false"/>
-                <w:color w:val="000000"/>
-                <w:sz w:val="19"/>
-                <w:szCs w:val="19"/>
-              </w:rPr>
-              <w:t xml:space="preserve">R$12</w:t>
-            </w:r>
-          </w:p>
-        </w:tc>
-      </w:tr>
-      <w:tr>
-        <w:tc>
-          <w:tcPr>
-            <w:tcW w:type="dxa" w:w="2256"/>
-          </w:tcPr>
-          <w:p>
-            <w:r>
-              <w:rPr>
-                <w:b w:val="false"/>
-                <w:bCs w:val="false"/>
-                <w:color w:val="000000"/>
-                <w:sz w:val="19"/>
-                <w:szCs w:val="19"/>
-              </w:rPr>
-              <w:t xml:space="preserve">Conversas iniciadas estimadas (total)</w:t>
-            </w:r>
-          </w:p>
-        </w:tc>
-        <w:tc>
-          <w:tcPr>
-            <w:tcW w:type="dxa" w:w="2256"/>
-          </w:tcPr>
-          <w:p>
-            <w:r>
-              <w:rPr>
-                <w:b w:val="false"/>
-                <w:bCs w:val="false"/>
-                <w:color w:val="000000"/>
-                <w:sz w:val="19"/>
-                <w:szCs w:val="19"/>
-              </w:rPr>
-              <w:t xml:space="preserve">~21</w:t>
-            </w:r>
-          </w:p>
-        </w:tc>
-        <w:tc>
-          <w:tcPr>
-            <w:tcW w:type="dxa" w:w="2256"/>
-          </w:tcPr>
-          <w:p>
-            <w:r>
-              <w:rPr>
-                <w:b w:val="false"/>
-                <w:bCs w:val="false"/>
-                <w:color w:val="000000"/>
-                <w:sz w:val="19"/>
-                <w:szCs w:val="19"/>
-              </w:rPr>
-              <w:t xml:space="preserve">~34</w:t>
-            </w:r>
-          </w:p>
-        </w:tc>
-        <w:tc>
-          <w:tcPr>
-            <w:tcW w:type="dxa" w:w="2256"/>
-          </w:tcPr>
-          <w:p>
-            <w:r>
-              <w:rPr>
-                <w:b w:val="false"/>
-                <w:bCs w:val="false"/>
-                <w:color w:val="000000"/>
-                <w:sz w:val="19"/>
-                <w:szCs w:val="19"/>
-              </w:rPr>
-              <w:t xml:space="preserve">~62</w:t>
+              <w:t xml:space="preserve">Da Vinci Gestão Imobiliária</w:t>
+            </w:r>
+          </w:p>
+        </w:tc>
+        <w:tc>
+          <w:tcPr>
+            <w:tcW w:type="dxa" w:w="2256"/>
+          </w:tcPr>
+          <w:p>
+            <w:r>
+              <w:rPr>
+                <w:b w:val="false"/>
+                <w:bCs w:val="false"/>
+                <w:color w:val="000000"/>
+                <w:sz w:val="19"/>
+                <w:szCs w:val="19"/>
+              </w:rPr>
+              <w:t xml:space="preserve">Canoas</w:t>
+            </w:r>
+          </w:p>
+        </w:tc>
+        <w:tc>
+          <w:tcPr>
+            <w:tcW w:type="dxa" w:w="2256"/>
+          </w:tcPr>
+          <w:p>
+            <w:r>
+              <w:rPr>
+                <w:b w:val="false"/>
+                <w:bCs w:val="false"/>
+                <w:color w:val="000000"/>
+                <w:sz w:val="19"/>
+                <w:szCs w:val="19"/>
+              </w:rPr>
+              <w:t xml:space="preserve">Rua Nazaré, 600</w:t>
+            </w:r>
+          </w:p>
+        </w:tc>
+        <w:tc>
+          <w:tcPr>
+            <w:tcW w:type="dxa" w:w="2256"/>
+          </w:tcPr>
+          <w:p>
+            <w:r>
+              <w:rPr>
+                <w:b w:val="false"/>
+                <w:bCs w:val="false"/>
+                <w:color w:val="000000"/>
+                <w:sz w:val="19"/>
+                <w:szCs w:val="19"/>
+              </w:rPr>
+              <w:t xml:space="preserve">Nossa Sra. das Graças</w:t>
             </w:r>
           </w:p>
         </w:tc>
@@ -2041,15 +1611,20 @@
           <w:sz w:val="21"/>
           <w:szCs w:val="21"/>
         </w:rPr>
-        <w:t xml:space="preserve">Sobre conversão (conversa → negócio):</w:t>
-      </w:r>
-      <w:r>
-        <w:rPr>
-          <w:sz w:val="21"/>
-          <w:szCs w:val="21"/>
-        </w:rPr>
-        <w:t xml:space="preserve"> não há histórico suficiente pra estimar com segurança essa etapa. Como hipótese de trabalho, sugiro considerar que de cada 5 a 10 conversas iniciadas, 1 tende a ser uma imobiliária real e qualificada (dono de fato interessado em vender, não curioso ou concorrente testando o anúncio) — e dessas, uma fração menor avança pra negociação de valores. Recomendo tratar isso como algo a </w:t>
-      </w:r>
+        <w:t xml:space="preserve">Atenção — 8 empresas da planilha sem bairro identificado:</w:t>
+      </w:r>
+      <w:r>
+        <w:rPr>
+          <w:sz w:val="21"/>
+          <w:szCs w:val="21"/>
+        </w:rPr>
+        <w:t xml:space="preserve"> 3R Administração Imobiliária, A Diretriz Imóveis, Imobiliária Acemil, Adacon Imóveis, Administradora Rio Grandense, Afreis Gestão Condominial, Cohen Imóveis e Imobiliária Exame têm só rua/CEP na planilha, sem bairro confirmado (não temos acesso a mapa neste ambiente pra confirmar a localização com segurança). Antes de criar o pin dessas, vale conferir o endereço completo num mapa (Google Maps) — não quis arriscar posicionar errado.</w:t>
+      </w:r>
+    </w:p>
+    <w:p>
+      <w:pPr>
+        <w:spacing w:after="160"/>
+      </w:pPr>
       <w:r>
         <w:rPr>
           <w:b/>
@@ -2057,14 +1632,35 @@
           <w:sz w:val="21"/>
           <w:szCs w:val="21"/>
         </w:rPr>
-        <w:t xml:space="preserve">medir durante o teste</w:t>
-      </w:r>
-      <w:r>
-        <w:rPr>
-          <w:sz w:val="21"/>
-          <w:szCs w:val="21"/>
-        </w:rPr>
-        <w:t xml:space="preserve">, não como projeção confiável, e ajustar a régua depois dos primeiros 15 dias com dado real.</w:t>
+        <w:t xml:space="preserve">Total de pins no conjunto de anúncios:</w:t>
+      </w:r>
+      <w:r>
+        <w:rPr>
+          <w:sz w:val="21"/>
+          <w:szCs w:val="21"/>
+        </w:rPr>
+        <w:t xml:space="preserve"> 5 clusters + 7 pins individuais = 12 pins (mais os das 8 empresas pendentes de confirmação, se quiser incluir depois de checar o endereço).</w:t>
+      </w:r>
+    </w:p>
+    <w:p>
+      <w:pPr>
+        <w:spacing w:after="160"/>
+      </w:pPr>
+      <w:r>
+        <w:rPr>
+          <w:b/>
+          <w:bCs/>
+          <w:sz w:val="21"/>
+          <w:szCs w:val="21"/>
+        </w:rPr>
+        <w:t xml:space="preserve">Como usar no Meta Ads:</w:t>
+      </w:r>
+      <w:r>
+        <w:rPr>
+          <w:sz w:val="21"/>
+          <w:szCs w:val="21"/>
+        </w:rPr>
+        <w:t xml:space="preserve"> no conjunto de anúncios, em "Localização", adicionar cada um dos pins acima (busca por bairro/endereço de referência no mapa do Gerenciador de Anúncios) com o raio indicado, em vez de selecionar "Porto Alegre" e "Canoas" como cidades inteiras.</w:t>
       </w:r>
     </w:p>
     <w:p>
@@ -2073,180 +1669,7 @@
         <w:spacing w:after="150" w:before="300"/>
       </w:pPr>
       <w:r>
-        <w:t xml:space="preserve">7. Legenda do anúncio</w:t>
-      </w:r>
-    </w:p>
-    <w:p>
-      <w:pPr>
-        <w:spacing w:after="160"/>
-      </w:pPr>
-      <w:r>
-        <w:rPr>
-          <w:sz w:val="21"/>
-          <w:szCs w:val="21"/>
-        </w:rPr>
-        <w:t xml:space="preserve">Como as duas artes têm exatamente o mesmo texto na imagem (só muda a foto do Giuliano), a recomendação é manter a </w:t>
-      </w:r>
-      <w:r>
-        <w:rPr>
-          <w:b/>
-          <w:bCs/>
-          <w:sz w:val="21"/>
-          <w:szCs w:val="21"/>
-        </w:rPr>
-        <w:t xml:space="preserve">mesma legenda nos dois anúncios</w:t>
-      </w:r>
-      <w:r>
-        <w:rPr>
-          <w:sz w:val="21"/>
-          <w:szCs w:val="21"/>
-        </w:rPr>
-        <w:t xml:space="preserve"> — isso isola a variável que está sendo testada (qual foto/visual performa melhor), sem misturar com variação de copy ao mesmo tempo. Testar duas coisas ao mesmo tempo (foto E texto) com uma base de R$50/dia não dá volume suficiente pra saber o que realmente fez diferença.</w:t>
-      </w:r>
-    </w:p>
-    <w:p>
-      <w:pPr>
-        <w:spacing w:after="80"/>
-      </w:pPr>
-      <w:r>
-        <w:rPr>
-          <w:i/>
-          <w:iCs/>
-          <w:color w:val="555555"/>
-          <w:sz w:val="18"/>
-          <w:szCs w:val="18"/>
-        </w:rPr>
-        <w:t xml:space="preserve">Legenda (texto principal do anúncio):</w:t>
-      </w:r>
-    </w:p>
-    <w:p>
-      <w:pPr>
-        <w:pBdr>
-          <w:left w:val="single" w:color="cccccc" w:sz="12" w:space="8"/>
-        </w:pBdr>
-        <w:spacing w:after="120"/>
-        <w:ind w:left="400"/>
-      </w:pPr>
-      <w:r>
-        <w:rPr>
-          <w:i/>
-          <w:iCs/>
-          <w:color w:val="333333"/>
-          <w:sz w:val="20"/>
-          <w:szCs w:val="20"/>
-        </w:rPr>
-        <w:t xml:space="preserve">Você é dono de imobiliária ou administradora em Porto Alegre ou Canoas?</w:t>
-      </w:r>
-    </w:p>
-    <w:p>
-      <w:pPr>
-        <w:spacing w:after="160"/>
-      </w:pPr>
-      <w:r>
-        <w:rPr>
-          <w:sz w:val="21"/>
-          <w:szCs w:val="21"/>
-        </w:rPr>
-        <w:t xml:space="preserve">&gt;</w:t>
-      </w:r>
-    </w:p>
-    <w:p>
-      <w:pPr>
-        <w:pBdr>
-          <w:left w:val="single" w:color="cccccc" w:sz="12" w:space="8"/>
-        </w:pBdr>
-        <w:spacing w:after="120"/>
-        <w:ind w:left="400"/>
-      </w:pPr>
-      <w:r>
-        <w:rPr>
-          <w:i/>
-          <w:iCs/>
-          <w:color w:val="333333"/>
-          <w:sz w:val="20"/>
-          <w:szCs w:val="20"/>
-        </w:rPr>
-        <w:t xml:space="preserve">A Eleva está adquirindo empresas e carteiras de aluguéis e condomínios na região, negociação direta com Giuliano Spolavori: +35 anos no mercado imobiliário, +2.200 condomínios geridos, +20 operações de M&amp;A, +8 mil imóveis locados.</w:t>
-      </w:r>
-    </w:p>
-    <w:p>
-      <w:pPr>
-        <w:spacing w:after="160"/>
-      </w:pPr>
-      <w:r>
-        <w:rPr>
-          <w:sz w:val="21"/>
-          <w:szCs w:val="21"/>
-        </w:rPr>
-        <w:t xml:space="preserve">&gt;</w:t>
-      </w:r>
-    </w:p>
-    <w:p>
-      <w:pPr>
-        <w:pBdr>
-          <w:left w:val="single" w:color="cccccc" w:sz="12" w:space="8"/>
-        </w:pBdr>
-        <w:spacing w:after="120"/>
-        <w:ind w:left="400"/>
-      </w:pPr>
-      <w:r>
-        <w:rPr>
-          <w:i/>
-          <w:iCs/>
-          <w:color w:val="333333"/>
-          <w:sz w:val="20"/>
-          <w:szCs w:val="20"/>
-        </w:rPr>
-        <w:t xml:space="preserve">Se interessou e quer saber como funciona?</w:t>
-      </w:r>
-    </w:p>
-    <w:p>
-      <w:pPr>
-        <w:pBdr>
-          <w:left w:val="single" w:color="cccccc" w:sz="12" w:space="8"/>
-        </w:pBdr>
-        <w:spacing w:after="120"/>
-        <w:ind w:left="400"/>
-      </w:pPr>
-      <w:r>
-        <w:rPr>
-          <w:i/>
-          <w:iCs/>
-          <w:color w:val="333333"/>
-          <w:sz w:val="20"/>
-          <w:szCs w:val="20"/>
-        </w:rPr>
-        <w:t xml:space="preserve">Toque no botão para conversar conosco através do WhatsApp 👇🏻</w:t>
-      </w:r>
-    </w:p>
-    <w:p>
-      <w:pPr>
-        <w:spacing w:after="160"/>
-      </w:pPr>
-      <w:r>
-        <w:rPr>
-          <w:b/>
-          <w:bCs/>
-          <w:sz w:val="21"/>
-          <w:szCs w:val="21"/>
-        </w:rPr>
-        <w:t xml:space="preserve">Botão do anúncio:</w:t>
-      </w:r>
-      <w:r>
-        <w:rPr>
-          <w:sz w:val="21"/>
-          <w:szCs w:val="21"/>
-        </w:rPr>
-        <w:t xml:space="preserve"> Fale conosco</w:t>
-      </w:r>
-    </w:p>
-    <w:p>
-      <w:pPr>
-        <w:pStyle w:val="Heading2"/>
-        <w:spacing w:after="150" w:before="300"/>
-      </w:pPr>
-      <w:r>
-        <w:t xml:space="preserve">8. Riscos e observações</w:t>
+        <w:t xml:space="preserve">4. Público sugerido (demografia e interesses)</w:t>
       </w:r>
     </w:p>
     <w:p>
@@ -2265,14 +1688,14 @@
           <w:sz w:val="21"/>
           <w:szCs w:val="21"/>
         </w:rPr>
-        <w:t xml:space="preserve">Público pequeno pode saturar rápido:</w:t>
-      </w:r>
-      <w:r>
-        <w:rPr>
-          <w:sz w:val="21"/>
-          <w:szCs w:val="21"/>
-        </w:rPr>
-        <w:t xml:space="preserve"> com frequência estimada de até 2,5 em 15 dias, vale monitorar se a mesma pessoa está vendo o anúncio repetidamente sem agir — sinal de já ter esgotado o público qualificado da região.</w:t>
+        <w:t xml:space="preserve">Localização:</w:t>
+      </w:r>
+      <w:r>
+        <w:rPr>
+          <w:sz w:val="21"/>
+          <w:szCs w:val="21"/>
+        </w:rPr>
+        <w:t xml:space="preserve"> os pins da seção 3 (5 clusters + pins individuais)</w:t>
       </w:r>
     </w:p>
     <w:p>
@@ -2291,14 +1714,14 @@
           <w:sz w:val="21"/>
           <w:szCs w:val="21"/>
         </w:rPr>
-        <w:t xml:space="preserve">Sem dado histórico é um risco assumido conscientemente:</w:t>
-      </w:r>
-      <w:r>
-        <w:rPr>
-          <w:sz w:val="21"/>
-          <w:szCs w:val="21"/>
-        </w:rPr>
-        <w:t xml:space="preserve"> os criativos já tiveram resultado em outro contexto/BM, mas isso não garante repetição de performance — pode ser público, período ou plataforma diferentes. Os 15 dias servem exatamente pra validar isso aqui, com esse público restrito.</w:t>
+        <w:t xml:space="preserve">Idade:</w:t>
+      </w:r>
+      <w:r>
+        <w:rPr>
+          <w:sz w:val="21"/>
+          <w:szCs w:val="21"/>
+        </w:rPr>
+        <w:t xml:space="preserve"> 30–65 anos</w:t>
       </w:r>
     </w:p>
     <w:p>
@@ -2317,14 +1740,14 @@
           <w:sz w:val="21"/>
           <w:szCs w:val="21"/>
         </w:rPr>
-        <w:t xml:space="preserve">Qualidade da conversa importa mais que quantidade:</w:t>
-      </w:r>
-      <w:r>
-        <w:rPr>
-          <w:sz w:val="21"/>
-          <w:szCs w:val="21"/>
-        </w:rPr>
-        <w:t xml:space="preserve"> dado o nicho ser tão específico (só quem realmente tem carteira pra vender), vale orientar quem for atender o WhatsApp a documentar rapidamente se cada conversa é "lead real" ou "curioso", pra conseguirmos calcular a taxa de conversão de verdade depois dos 15 dias.</w:t>
+        <w:t xml:space="preserve">Gênero:</w:t>
+      </w:r>
+      <w:r>
+        <w:rPr>
+          <w:sz w:val="21"/>
+          <w:szCs w:val="21"/>
+        </w:rPr>
+        <w:t xml:space="preserve"> todos</w:t>
       </w:r>
     </w:p>
     <w:p>
@@ -2343,6 +1766,1234 @@
           <w:sz w:val="21"/>
           <w:szCs w:val="21"/>
         </w:rPr>
+        <w:t xml:space="preserve">Interesses (segmentação detalhada manual, combinados com "OU" — sem estreitar):</w:t>
+      </w:r>
+      <w:r>
+        <w:rPr>
+          <w:sz w:val="21"/>
+          <w:szCs w:val="21"/>
+        </w:rPr>
+        <w:t xml:space="preserve"> Mercado imobiliário, Corretagem de imóveis, Gestão de propriedades, Investimento imobiliário, Administração de condomínios</w:t>
+      </w:r>
+    </w:p>
+    <w:p>
+      <w:pPr>
+        <w:pStyle w:val="ListParagraph"/>
+        <w:numPr>
+          <w:ilvl w:val="0"/>
+          <w:numId w:val="1"/>
+        </w:numPr>
+        <w:spacing w:after="80"/>
+      </w:pPr>
+      <w:r>
+        <w:rPr>
+          <w:b/>
+          <w:bCs/>
+          <w:sz w:val="21"/>
+          <w:szCs w:val="21"/>
+        </w:rPr>
+        <w:t xml:space="preserve">Expansão de detalhamento de público:</w:t>
+      </w:r>
+      <w:r>
+        <w:rPr>
+          <w:sz w:val="21"/>
+          <w:szCs w:val="21"/>
+        </w:rPr>
+        <w:t xml:space="preserve"> </w:t>
+      </w:r>
+      <w:r>
+        <w:rPr>
+          <w:b/>
+          <w:bCs/>
+          <w:sz w:val="21"/>
+          <w:szCs w:val="21"/>
+        </w:rPr>
+        <w:t xml:space="preserve">desativada</w:t>
+      </w:r>
+      <w:r>
+        <w:rPr>
+          <w:sz w:val="21"/>
+          <w:szCs w:val="21"/>
+        </w:rPr>
+        <w:t xml:space="preserve"> — com orçamento de R$50/dia e público já hiperlocal, deixar o Meta "expandir" pra fora dos interesses definidos arrisca gastar verba testando gente fora do perfil antes de aprender.</w:t>
+      </w:r>
+    </w:p>
+    <w:p>
+      <w:pPr>
+        <w:pStyle w:val="ListParagraph"/>
+        <w:numPr>
+          <w:ilvl w:val="0"/>
+          <w:numId w:val="1"/>
+        </w:numPr>
+        <w:spacing w:after="80"/>
+      </w:pPr>
+      <w:r>
+        <w:rPr>
+          <w:b/>
+          <w:bCs/>
+          <w:sz w:val="21"/>
+          <w:szCs w:val="21"/>
+        </w:rPr>
+        <w:t xml:space="preserve">Posicionamento:</w:t>
+      </w:r>
+      <w:r>
+        <w:rPr>
+          <w:sz w:val="21"/>
+          <w:szCs w:val="21"/>
+        </w:rPr>
+        <w:t xml:space="preserve"> manual — selecionar diretamente Feed do Instagram e Facebook + Stories (os formatos mais diretos pra esse tipo de anúncio), em vez de deixar no automático (Advantage+ Posicionamentos). Com pouca verba e só 15 dias, não vale gastar tempo de aprendizado do algoritmo testando posicionamento — melhor já ir direto no que costuma performar melhor pra esse tipo de campanha.</w:t>
+      </w:r>
+    </w:p>
+    <w:p>
+      <w:pPr>
+        <w:spacing w:after="160"/>
+      </w:pPr>
+      <w:r>
+        <w:rPr>
+          <w:b/>
+          <w:bCs/>
+          <w:sz w:val="21"/>
+          <w:szCs w:val="21"/>
+        </w:rPr>
+        <w:t xml:space="preserve">Reforço no criativo/legenda:</w:t>
+      </w:r>
+      <w:r>
+        <w:rPr>
+          <w:sz w:val="21"/>
+          <w:szCs w:val="21"/>
+        </w:rPr>
+        <w:t xml:space="preserve"> usar termos como "dono de imobiliária", "administradora de aluguéis e condomínios", "carteira de imóveis" na legenda, pra quem não se identificar simplesmente ignorar o anúncio — essa é a segmentação "de verdade" nesse caso.</w:t>
+      </w:r>
+    </w:p>
+    <w:p>
+      <w:pPr>
+        <w:pStyle w:val="Heading2"/>
+        <w:spacing w:after="150" w:before="300"/>
+      </w:pPr>
+      <w:r>
+        <w:t xml:space="preserve">5. Cronograma e orçamento do teste</w:t>
+      </w:r>
+    </w:p>
+    <w:p>
+      <w:pPr>
+        <w:pStyle w:val="ListParagraph"/>
+        <w:numPr>
+          <w:ilvl w:val="0"/>
+          <w:numId w:val="1"/>
+        </w:numPr>
+        <w:spacing w:after="80"/>
+      </w:pPr>
+      <w:r>
+        <w:rPr>
+          <w:b/>
+          <w:bCs/>
+          <w:sz w:val="21"/>
+          <w:szCs w:val="21"/>
+        </w:rPr>
+        <w:t xml:space="preserve">Duração:</w:t>
+      </w:r>
+      <w:r>
+        <w:rPr>
+          <w:sz w:val="21"/>
+          <w:szCs w:val="21"/>
+        </w:rPr>
+        <w:t xml:space="preserve"> 15 dias corridos</w:t>
+      </w:r>
+    </w:p>
+    <w:p>
+      <w:pPr>
+        <w:pStyle w:val="ListParagraph"/>
+        <w:numPr>
+          <w:ilvl w:val="0"/>
+          <w:numId w:val="1"/>
+        </w:numPr>
+        <w:spacing w:after="80"/>
+      </w:pPr>
+      <w:r>
+        <w:rPr>
+          <w:b/>
+          <w:bCs/>
+          <w:sz w:val="21"/>
+          <w:szCs w:val="21"/>
+        </w:rPr>
+        <w:t xml:space="preserve">Orçamento diário:</w:t>
+      </w:r>
+      <w:r>
+        <w:rPr>
+          <w:sz w:val="21"/>
+          <w:szCs w:val="21"/>
+        </w:rPr>
+        <w:t xml:space="preserve"> R$50</w:t>
+      </w:r>
+    </w:p>
+    <w:p>
+      <w:pPr>
+        <w:pStyle w:val="ListParagraph"/>
+        <w:numPr>
+          <w:ilvl w:val="0"/>
+          <w:numId w:val="1"/>
+        </w:numPr>
+        <w:spacing w:after="80"/>
+      </w:pPr>
+      <w:r>
+        <w:rPr>
+          <w:b/>
+          <w:bCs/>
+          <w:sz w:val="21"/>
+          <w:szCs w:val="21"/>
+        </w:rPr>
+        <w:t xml:space="preserve">Orçamento total do teste:</w:t>
+      </w:r>
+      <w:r>
+        <w:rPr>
+          <w:sz w:val="21"/>
+          <w:szCs w:val="21"/>
+        </w:rPr>
+        <w:t xml:space="preserve"> R$750</w:t>
+      </w:r>
+    </w:p>
+    <w:p>
+      <w:pPr>
+        <w:pStyle w:val="ListParagraph"/>
+        <w:numPr>
+          <w:ilvl w:val="0"/>
+          <w:numId w:val="1"/>
+        </w:numPr>
+        <w:spacing w:after="80"/>
+      </w:pPr>
+      <w:r>
+        <w:rPr>
+          <w:b/>
+          <w:bCs/>
+          <w:sz w:val="21"/>
+          <w:szCs w:val="21"/>
+        </w:rPr>
+        <w:t xml:space="preserve">Critério de decisão ao final:</w:t>
+      </w:r>
+      <w:r>
+        <w:rPr>
+          <w:sz w:val="21"/>
+          <w:szCs w:val="21"/>
+        </w:rPr>
+        <w:t xml:space="preserve"> se o custo por conversa iniciada estiver dentro do razoável (seção 6) e/ou já surgir pelo menos 1 conversa qualificada (imobiliária real, carteira real), aumentar o orçamento. Se não houver nenhuma conversa qualificada em 15 dias, revisar público e/ou criativo antes de aumentar verba.</w:t>
+      </w:r>
+    </w:p>
+    <w:p>
+      <w:pPr>
+        <w:pStyle w:val="Heading2"/>
+        <w:spacing w:after="150" w:before="300"/>
+      </w:pPr>
+      <w:r>
+        <w:t xml:space="preserve">6. Projeção de métricas (cenários, acumulado dos 15 dias) — estimativa, não dado real</w:t>
+      </w:r>
+    </w:p>
+    <w:p>
+      <w:pPr>
+        <w:spacing w:after="160"/>
+      </w:pPr>
+      <w:r>
+        <w:rPr>
+          <w:b/>
+          <w:bCs/>
+          <w:sz w:val="21"/>
+          <w:szCs w:val="21"/>
+        </w:rPr>
+        <w:t xml:space="preserve">Premissa:</w:t>
+      </w:r>
+      <w:r>
+        <w:rPr>
+          <w:sz w:val="21"/>
+          <w:szCs w:val="21"/>
+        </w:rPr>
+        <w:t xml:space="preserve"> sem CPM histórico desse público específico (por não haver dado da campanha anterior nesta BM), a projeção usa benchmark geral de Meta Ads B2B no Brasil, ajustado pra cima pela restrição geográfica forte (público pequeno tende a aumentar CPM), e pra baixo pela segmentação por cluster (seção 3), que deve melhorar a eficiência frente a segmentar a cidade inteira.</w:t>
+      </w:r>
+    </w:p>
+    <w:p>
+      <w:pPr>
+        <w:spacing w:after="80"/>
+      </w:pPr>
+      <w:r>
+        <w:rPr>
+          <w:i/>
+          <w:iCs/>
+          <w:color w:val="555555"/>
+          <w:sz w:val="18"/>
+          <w:szCs w:val="18"/>
+        </w:rPr>
+        <w:t xml:space="preserve">Todos os números abaixo são o total acumulado dos 15 dias de campanha (R$750 no total, não por dia).</w:t>
+      </w:r>
+    </w:p>
+    <w:tbl>
+      <w:tblPr>
+        <w:tblW w:type="dxa" w:w="9026"/>
+        <w:tblBorders>
+          <w:top w:val="single" w:color="auto" w:sz="4"/>
+          <w:left w:val="single" w:color="auto" w:sz="4"/>
+          <w:bottom w:val="single" w:color="auto" w:sz="4"/>
+          <w:right w:val="single" w:color="auto" w:sz="4"/>
+          <w:insideH w:val="single" w:color="auto" w:sz="4"/>
+          <w:insideV w:val="single" w:color="auto" w:sz="4"/>
+        </w:tblBorders>
+      </w:tblPr>
+      <w:tblGrid>
+        <w:gridCol w:w="2256"/>
+        <w:gridCol w:w="2256"/>
+        <w:gridCol w:w="2256"/>
+        <w:gridCol w:w="2256"/>
+      </w:tblGrid>
+      <w:tr>
+        <w:tc>
+          <w:tcPr>
+            <w:tcW w:type="dxa" w:w="2256"/>
+            <w:shd w:fill="1c2b4a" w:val="clear"/>
+          </w:tcPr>
+          <w:p>
+            <w:r>
+              <w:rPr>
+                <w:b/>
+                <w:bCs/>
+                <w:color w:val="FFFFFF"/>
+                <w:sz w:val="19"/>
+                <w:szCs w:val="19"/>
+              </w:rPr>
+              <w:t xml:space="preserve">Métrica</w:t>
+            </w:r>
+          </w:p>
+        </w:tc>
+        <w:tc>
+          <w:tcPr>
+            <w:tcW w:type="dxa" w:w="2256"/>
+            <w:shd w:fill="1c2b4a" w:val="clear"/>
+          </w:tcPr>
+          <w:p>
+            <w:r>
+              <w:rPr>
+                <w:b/>
+                <w:bCs/>
+                <w:color w:val="FFFFFF"/>
+                <w:sz w:val="19"/>
+                <w:szCs w:val="19"/>
+              </w:rPr>
+              <w:t xml:space="preserve">Conservador</w:t>
+            </w:r>
+          </w:p>
+        </w:tc>
+        <w:tc>
+          <w:tcPr>
+            <w:tcW w:type="dxa" w:w="2256"/>
+            <w:shd w:fill="1c2b4a" w:val="clear"/>
+          </w:tcPr>
+          <w:p>
+            <w:r>
+              <w:rPr>
+                <w:b/>
+                <w:bCs/>
+                <w:color w:val="FFFFFF"/>
+                <w:sz w:val="19"/>
+                <w:szCs w:val="19"/>
+              </w:rPr>
+              <w:t xml:space="preserve">Realista</w:t>
+            </w:r>
+          </w:p>
+        </w:tc>
+        <w:tc>
+          <w:tcPr>
+            <w:tcW w:type="dxa" w:w="2256"/>
+            <w:shd w:fill="1c2b4a" w:val="clear"/>
+          </w:tcPr>
+          <w:p>
+            <w:r>
+              <w:rPr>
+                <w:b/>
+                <w:bCs/>
+                <w:color w:val="FFFFFF"/>
+                <w:sz w:val="19"/>
+                <w:szCs w:val="19"/>
+              </w:rPr>
+              <w:t xml:space="preserve">Otimista</w:t>
+            </w:r>
+          </w:p>
+        </w:tc>
+      </w:tr>
+      <w:tr>
+        <w:tc>
+          <w:tcPr>
+            <w:tcW w:type="dxa" w:w="2256"/>
+          </w:tcPr>
+          <w:p>
+            <w:r>
+              <w:rPr>
+                <w:b w:val="false"/>
+                <w:bCs w:val="false"/>
+                <w:color w:val="000000"/>
+                <w:sz w:val="19"/>
+                <w:szCs w:val="19"/>
+              </w:rPr>
+              <w:t xml:space="preserve">CPM (custo por mil impressões)</w:t>
+            </w:r>
+          </w:p>
+        </w:tc>
+        <w:tc>
+          <w:tcPr>
+            <w:tcW w:type="dxa" w:w="2256"/>
+          </w:tcPr>
+          <w:p>
+            <w:r>
+              <w:rPr>
+                <w:b w:val="false"/>
+                <w:bCs w:val="false"/>
+                <w:color w:val="000000"/>
+                <w:sz w:val="19"/>
+                <w:szCs w:val="19"/>
+              </w:rPr>
+              <w:t xml:space="preserve">R$35</w:t>
+            </w:r>
+          </w:p>
+        </w:tc>
+        <w:tc>
+          <w:tcPr>
+            <w:tcW w:type="dxa" w:w="2256"/>
+          </w:tcPr>
+          <w:p>
+            <w:r>
+              <w:rPr>
+                <w:b w:val="false"/>
+                <w:bCs w:val="false"/>
+                <w:color w:val="000000"/>
+                <w:sz w:val="19"/>
+                <w:szCs w:val="19"/>
+              </w:rPr>
+              <w:t xml:space="preserve">R$25</w:t>
+            </w:r>
+          </w:p>
+        </w:tc>
+        <w:tc>
+          <w:tcPr>
+            <w:tcW w:type="dxa" w:w="2256"/>
+          </w:tcPr>
+          <w:p>
+            <w:r>
+              <w:rPr>
+                <w:b w:val="false"/>
+                <w:bCs w:val="false"/>
+                <w:color w:val="000000"/>
+                <w:sz w:val="19"/>
+                <w:szCs w:val="19"/>
+              </w:rPr>
+              <w:t xml:space="preserve">R$15</w:t>
+            </w:r>
+          </w:p>
+        </w:tc>
+      </w:tr>
+      <w:tr>
+        <w:tc>
+          <w:tcPr>
+            <w:tcW w:type="dxa" w:w="2256"/>
+          </w:tcPr>
+          <w:p>
+            <w:r>
+              <w:rPr>
+                <w:b w:val="false"/>
+                <w:bCs w:val="false"/>
+                <w:color w:val="000000"/>
+                <w:sz w:val="19"/>
+                <w:szCs w:val="19"/>
+              </w:rPr>
+              <w:t xml:space="preserve">Impressões (total, 15 dias)</w:t>
+            </w:r>
+          </w:p>
+        </w:tc>
+        <w:tc>
+          <w:tcPr>
+            <w:tcW w:type="dxa" w:w="2256"/>
+          </w:tcPr>
+          <w:p>
+            <w:r>
+              <w:rPr>
+                <w:b w:val="false"/>
+                <w:bCs w:val="false"/>
+                <w:color w:val="000000"/>
+                <w:sz w:val="19"/>
+                <w:szCs w:val="19"/>
+              </w:rPr>
+              <w:t xml:space="preserve">~21.400</w:t>
+            </w:r>
+          </w:p>
+        </w:tc>
+        <w:tc>
+          <w:tcPr>
+            <w:tcW w:type="dxa" w:w="2256"/>
+          </w:tcPr>
+          <w:p>
+            <w:r>
+              <w:rPr>
+                <w:b w:val="false"/>
+                <w:bCs w:val="false"/>
+                <w:color w:val="000000"/>
+                <w:sz w:val="19"/>
+                <w:szCs w:val="19"/>
+              </w:rPr>
+              <w:t xml:space="preserve">~30.000</w:t>
+            </w:r>
+          </w:p>
+        </w:tc>
+        <w:tc>
+          <w:tcPr>
+            <w:tcW w:type="dxa" w:w="2256"/>
+          </w:tcPr>
+          <w:p>
+            <w:r>
+              <w:rPr>
+                <w:b w:val="false"/>
+                <w:bCs w:val="false"/>
+                <w:color w:val="000000"/>
+                <w:sz w:val="19"/>
+                <w:szCs w:val="19"/>
+              </w:rPr>
+              <w:t xml:space="preserve">~50.000</w:t>
+            </w:r>
+          </w:p>
+        </w:tc>
+      </w:tr>
+      <w:tr>
+        <w:tc>
+          <w:tcPr>
+            <w:tcW w:type="dxa" w:w="2256"/>
+          </w:tcPr>
+          <w:p>
+            <w:r>
+              <w:rPr>
+                <w:b w:val="false"/>
+                <w:bCs w:val="false"/>
+                <w:color w:val="000000"/>
+                <w:sz w:val="19"/>
+                <w:szCs w:val="19"/>
+              </w:rPr>
+              <w:t xml:space="preserve">Frequência estimada</w:t>
+            </w:r>
+          </w:p>
+        </w:tc>
+        <w:tc>
+          <w:tcPr>
+            <w:tcW w:type="dxa" w:w="2256"/>
+          </w:tcPr>
+          <w:p>
+            <w:r>
+              <w:rPr>
+                <w:b w:val="false"/>
+                <w:bCs w:val="false"/>
+                <w:color w:val="000000"/>
+                <w:sz w:val="19"/>
+                <w:szCs w:val="19"/>
+              </w:rPr>
+              <w:t xml:space="preserve">2,5</w:t>
+            </w:r>
+          </w:p>
+        </w:tc>
+        <w:tc>
+          <w:tcPr>
+            <w:tcW w:type="dxa" w:w="2256"/>
+          </w:tcPr>
+          <w:p>
+            <w:r>
+              <w:rPr>
+                <w:b w:val="false"/>
+                <w:bCs w:val="false"/>
+                <w:color w:val="000000"/>
+                <w:sz w:val="19"/>
+                <w:szCs w:val="19"/>
+              </w:rPr>
+              <w:t xml:space="preserve">2,0</w:t>
+            </w:r>
+          </w:p>
+        </w:tc>
+        <w:tc>
+          <w:tcPr>
+            <w:tcW w:type="dxa" w:w="2256"/>
+          </w:tcPr>
+          <w:p>
+            <w:r>
+              <w:rPr>
+                <w:b w:val="false"/>
+                <w:bCs w:val="false"/>
+                <w:color w:val="000000"/>
+                <w:sz w:val="19"/>
+                <w:szCs w:val="19"/>
+              </w:rPr>
+              <w:t xml:space="preserve">1,6</w:t>
+            </w:r>
+          </w:p>
+        </w:tc>
+      </w:tr>
+      <w:tr>
+        <w:tc>
+          <w:tcPr>
+            <w:tcW w:type="dxa" w:w="2256"/>
+          </w:tcPr>
+          <w:p>
+            <w:r>
+              <w:rPr>
+                <w:b w:val="false"/>
+                <w:bCs w:val="false"/>
+                <w:color w:val="000000"/>
+                <w:sz w:val="19"/>
+                <w:szCs w:val="19"/>
+              </w:rPr>
+              <w:t xml:space="preserve">Alcance estimado</w:t>
+            </w:r>
+          </w:p>
+        </w:tc>
+        <w:tc>
+          <w:tcPr>
+            <w:tcW w:type="dxa" w:w="2256"/>
+          </w:tcPr>
+          <w:p>
+            <w:r>
+              <w:rPr>
+                <w:b w:val="false"/>
+                <w:bCs w:val="false"/>
+                <w:color w:val="000000"/>
+                <w:sz w:val="19"/>
+                <w:szCs w:val="19"/>
+              </w:rPr>
+              <w:t xml:space="preserve">~8.500</w:t>
+            </w:r>
+          </w:p>
+        </w:tc>
+        <w:tc>
+          <w:tcPr>
+            <w:tcW w:type="dxa" w:w="2256"/>
+          </w:tcPr>
+          <w:p>
+            <w:r>
+              <w:rPr>
+                <w:b w:val="false"/>
+                <w:bCs w:val="false"/>
+                <w:color w:val="000000"/>
+                <w:sz w:val="19"/>
+                <w:szCs w:val="19"/>
+              </w:rPr>
+              <w:t xml:space="preserve">~15.000</w:t>
+            </w:r>
+          </w:p>
+        </w:tc>
+        <w:tc>
+          <w:tcPr>
+            <w:tcW w:type="dxa" w:w="2256"/>
+          </w:tcPr>
+          <w:p>
+            <w:r>
+              <w:rPr>
+                <w:b w:val="false"/>
+                <w:bCs w:val="false"/>
+                <w:color w:val="000000"/>
+                <w:sz w:val="19"/>
+                <w:szCs w:val="19"/>
+              </w:rPr>
+              <w:t xml:space="preserve">~31.000</w:t>
+            </w:r>
+          </w:p>
+        </w:tc>
+      </w:tr>
+      <w:tr>
+        <w:tc>
+          <w:tcPr>
+            <w:tcW w:type="dxa" w:w="2256"/>
+          </w:tcPr>
+          <w:p>
+            <w:r>
+              <w:rPr>
+                <w:b w:val="false"/>
+                <w:bCs w:val="false"/>
+                <w:color w:val="000000"/>
+                <w:sz w:val="19"/>
+                <w:szCs w:val="19"/>
+              </w:rPr>
+              <w:t xml:space="preserve">CTR (todos os cliques)</w:t>
+            </w:r>
+          </w:p>
+        </w:tc>
+        <w:tc>
+          <w:tcPr>
+            <w:tcW w:type="dxa" w:w="2256"/>
+          </w:tcPr>
+          <w:p>
+            <w:r>
+              <w:rPr>
+                <w:b w:val="false"/>
+                <w:bCs w:val="false"/>
+                <w:color w:val="000000"/>
+                <w:sz w:val="19"/>
+                <w:szCs w:val="19"/>
+              </w:rPr>
+              <w:t xml:space="preserve">1,0%</w:t>
+            </w:r>
+          </w:p>
+        </w:tc>
+        <w:tc>
+          <w:tcPr>
+            <w:tcW w:type="dxa" w:w="2256"/>
+          </w:tcPr>
+          <w:p>
+            <w:r>
+              <w:rPr>
+                <w:b w:val="false"/>
+                <w:bCs w:val="false"/>
+                <w:color w:val="000000"/>
+                <w:sz w:val="19"/>
+                <w:szCs w:val="19"/>
+              </w:rPr>
+              <w:t xml:space="preserve">1,8%</w:t>
+            </w:r>
+          </w:p>
+        </w:tc>
+        <w:tc>
+          <w:tcPr>
+            <w:tcW w:type="dxa" w:w="2256"/>
+          </w:tcPr>
+          <w:p>
+            <w:r>
+              <w:rPr>
+                <w:b w:val="false"/>
+                <w:bCs w:val="false"/>
+                <w:color w:val="000000"/>
+                <w:sz w:val="19"/>
+                <w:szCs w:val="19"/>
+              </w:rPr>
+              <w:t xml:space="preserve">2,5%</w:t>
+            </w:r>
+          </w:p>
+        </w:tc>
+      </w:tr>
+      <w:tr>
+        <w:tc>
+          <w:tcPr>
+            <w:tcW w:type="dxa" w:w="2256"/>
+          </w:tcPr>
+          <w:p>
+            <w:r>
+              <w:rPr>
+                <w:b w:val="false"/>
+                <w:bCs w:val="false"/>
+                <w:color w:val="000000"/>
+                <w:sz w:val="19"/>
+                <w:szCs w:val="19"/>
+              </w:rPr>
+              <w:t xml:space="preserve">Cliques estimados (total)</w:t>
+            </w:r>
+          </w:p>
+        </w:tc>
+        <w:tc>
+          <w:tcPr>
+            <w:tcW w:type="dxa" w:w="2256"/>
+          </w:tcPr>
+          <w:p>
+            <w:r>
+              <w:rPr>
+                <w:b w:val="false"/>
+                <w:bCs w:val="false"/>
+                <w:color w:val="000000"/>
+                <w:sz w:val="19"/>
+                <w:szCs w:val="19"/>
+              </w:rPr>
+              <w:t xml:space="preserve">~214</w:t>
+            </w:r>
+          </w:p>
+        </w:tc>
+        <w:tc>
+          <w:tcPr>
+            <w:tcW w:type="dxa" w:w="2256"/>
+          </w:tcPr>
+          <w:p>
+            <w:r>
+              <w:rPr>
+                <w:b w:val="false"/>
+                <w:bCs w:val="false"/>
+                <w:color w:val="000000"/>
+                <w:sz w:val="19"/>
+                <w:szCs w:val="19"/>
+              </w:rPr>
+              <w:t xml:space="preserve">~540</w:t>
+            </w:r>
+          </w:p>
+        </w:tc>
+        <w:tc>
+          <w:tcPr>
+            <w:tcW w:type="dxa" w:w="2256"/>
+          </w:tcPr>
+          <w:p>
+            <w:r>
+              <w:rPr>
+                <w:b w:val="false"/>
+                <w:bCs w:val="false"/>
+                <w:color w:val="000000"/>
+                <w:sz w:val="19"/>
+                <w:szCs w:val="19"/>
+              </w:rPr>
+              <w:t xml:space="preserve">~1.250</w:t>
+            </w:r>
+          </w:p>
+        </w:tc>
+      </w:tr>
+      <w:tr>
+        <w:tc>
+          <w:tcPr>
+            <w:tcW w:type="dxa" w:w="2256"/>
+          </w:tcPr>
+          <w:p>
+            <w:r>
+              <w:rPr>
+                <w:b w:val="false"/>
+                <w:bCs w:val="false"/>
+                <w:color w:val="000000"/>
+                <w:sz w:val="19"/>
+                <w:szCs w:val="19"/>
+              </w:rPr>
+              <w:t xml:space="preserve">Custo por conversa iniciada (WhatsApp)</w:t>
+            </w:r>
+          </w:p>
+        </w:tc>
+        <w:tc>
+          <w:tcPr>
+            <w:tcW w:type="dxa" w:w="2256"/>
+          </w:tcPr>
+          <w:p>
+            <w:r>
+              <w:rPr>
+                <w:b w:val="false"/>
+                <w:bCs w:val="false"/>
+                <w:color w:val="000000"/>
+                <w:sz w:val="19"/>
+                <w:szCs w:val="19"/>
+              </w:rPr>
+              <w:t xml:space="preserve">R$35</w:t>
+            </w:r>
+          </w:p>
+        </w:tc>
+        <w:tc>
+          <w:tcPr>
+            <w:tcW w:type="dxa" w:w="2256"/>
+          </w:tcPr>
+          <w:p>
+            <w:r>
+              <w:rPr>
+                <w:b w:val="false"/>
+                <w:bCs w:val="false"/>
+                <w:color w:val="000000"/>
+                <w:sz w:val="19"/>
+                <w:szCs w:val="19"/>
+              </w:rPr>
+              <w:t xml:space="preserve">R$22</w:t>
+            </w:r>
+          </w:p>
+        </w:tc>
+        <w:tc>
+          <w:tcPr>
+            <w:tcW w:type="dxa" w:w="2256"/>
+          </w:tcPr>
+          <w:p>
+            <w:r>
+              <w:rPr>
+                <w:b w:val="false"/>
+                <w:bCs w:val="false"/>
+                <w:color w:val="000000"/>
+                <w:sz w:val="19"/>
+                <w:szCs w:val="19"/>
+              </w:rPr>
+              <w:t xml:space="preserve">R$12</w:t>
+            </w:r>
+          </w:p>
+        </w:tc>
+      </w:tr>
+      <w:tr>
+        <w:tc>
+          <w:tcPr>
+            <w:tcW w:type="dxa" w:w="2256"/>
+          </w:tcPr>
+          <w:p>
+            <w:r>
+              <w:rPr>
+                <w:b w:val="false"/>
+                <w:bCs w:val="false"/>
+                <w:color w:val="000000"/>
+                <w:sz w:val="19"/>
+                <w:szCs w:val="19"/>
+              </w:rPr>
+              <w:t xml:space="preserve">Conversas iniciadas estimadas (total)</w:t>
+            </w:r>
+          </w:p>
+        </w:tc>
+        <w:tc>
+          <w:tcPr>
+            <w:tcW w:type="dxa" w:w="2256"/>
+          </w:tcPr>
+          <w:p>
+            <w:r>
+              <w:rPr>
+                <w:b w:val="false"/>
+                <w:bCs w:val="false"/>
+                <w:color w:val="000000"/>
+                <w:sz w:val="19"/>
+                <w:szCs w:val="19"/>
+              </w:rPr>
+              <w:t xml:space="preserve">~21</w:t>
+            </w:r>
+          </w:p>
+        </w:tc>
+        <w:tc>
+          <w:tcPr>
+            <w:tcW w:type="dxa" w:w="2256"/>
+          </w:tcPr>
+          <w:p>
+            <w:r>
+              <w:rPr>
+                <w:b w:val="false"/>
+                <w:bCs w:val="false"/>
+                <w:color w:val="000000"/>
+                <w:sz w:val="19"/>
+                <w:szCs w:val="19"/>
+              </w:rPr>
+              <w:t xml:space="preserve">~34</w:t>
+            </w:r>
+          </w:p>
+        </w:tc>
+        <w:tc>
+          <w:tcPr>
+            <w:tcW w:type="dxa" w:w="2256"/>
+          </w:tcPr>
+          <w:p>
+            <w:r>
+              <w:rPr>
+                <w:b w:val="false"/>
+                <w:bCs w:val="false"/>
+                <w:color w:val="000000"/>
+                <w:sz w:val="19"/>
+                <w:szCs w:val="19"/>
+              </w:rPr>
+              <w:t xml:space="preserve">~62</w:t>
+            </w:r>
+          </w:p>
+        </w:tc>
+      </w:tr>
+    </w:tbl>
+    <w:p>
+      <w:pPr>
+        <w:spacing w:after="160"/>
+      </w:pPr>
+    </w:p>
+    <w:p>
+      <w:pPr>
+        <w:spacing w:after="160"/>
+      </w:pPr>
+      <w:r>
+        <w:rPr>
+          <w:b/>
+          <w:bCs/>
+          <w:sz w:val="21"/>
+          <w:szCs w:val="21"/>
+        </w:rPr>
+        <w:t xml:space="preserve">Sobre conversão (conversa até virar negócio):</w:t>
+      </w:r>
+      <w:r>
+        <w:rPr>
+          <w:sz w:val="21"/>
+          <w:szCs w:val="21"/>
+        </w:rPr>
+        <w:t xml:space="preserve"> não há histórico suficiente pra estimar com segurança essa etapa. Como hipótese de trabalho, sugiro considerar que de cada 5 a 10 conversas iniciadas, 1 tende a ser uma imobiliária real e qualificada (dono de fato interessado em vender, não curioso ou concorrente testando o anúncio) — e dessas, uma fração menor avança pra negociação de valores. Recomendo tratar isso como algo a </w:t>
+      </w:r>
+      <w:r>
+        <w:rPr>
+          <w:b/>
+          <w:bCs/>
+          <w:sz w:val="21"/>
+          <w:szCs w:val="21"/>
+        </w:rPr>
+        <w:t xml:space="preserve">medir durante o teste</w:t>
+      </w:r>
+      <w:r>
+        <w:rPr>
+          <w:sz w:val="21"/>
+          <w:szCs w:val="21"/>
+        </w:rPr>
+        <w:t xml:space="preserve">, não como projeção confiável, e ajustar a régua depois dos primeiros 15 dias com dado real.</w:t>
+      </w:r>
+    </w:p>
+    <w:p>
+      <w:pPr>
+        <w:pStyle w:val="Heading2"/>
+        <w:spacing w:after="150" w:before="300"/>
+      </w:pPr>
+      <w:r>
+        <w:t xml:space="preserve">7. Legenda do anúncio</w:t>
+      </w:r>
+    </w:p>
+    <w:p>
+      <w:pPr>
+        <w:spacing w:after="160"/>
+      </w:pPr>
+      <w:r>
+        <w:rPr>
+          <w:sz w:val="21"/>
+          <w:szCs w:val="21"/>
+        </w:rPr>
+        <w:t xml:space="preserve">Como as duas artes têm exatamente o mesmo texto na imagem (só muda a foto do Giuliano), a recomendação é manter a </w:t>
+      </w:r>
+      <w:r>
+        <w:rPr>
+          <w:b/>
+          <w:bCs/>
+          <w:sz w:val="21"/>
+          <w:szCs w:val="21"/>
+        </w:rPr>
+        <w:t xml:space="preserve">mesma legenda nos dois anúncios</w:t>
+      </w:r>
+      <w:r>
+        <w:rPr>
+          <w:sz w:val="21"/>
+          <w:szCs w:val="21"/>
+        </w:rPr>
+        <w:t xml:space="preserve"> — isso isola a variável que está sendo testada (qual foto/visual performa melhor), sem misturar com variação de copy ao mesmo tempo. Testar duas coisas ao mesmo tempo (foto E texto) com uma base de R$50/dia não dá volume suficiente pra saber o que realmente fez diferença.</w:t>
+      </w:r>
+    </w:p>
+    <w:p>
+      <w:pPr>
+        <w:spacing w:after="80"/>
+      </w:pPr>
+      <w:r>
+        <w:rPr>
+          <w:i/>
+          <w:iCs/>
+          <w:color w:val="555555"/>
+          <w:sz w:val="18"/>
+          <w:szCs w:val="18"/>
+        </w:rPr>
+        <w:t xml:space="preserve">Legenda (texto principal do anúncio):</w:t>
+      </w:r>
+    </w:p>
+    <w:p>
+      <w:pPr>
+        <w:pBdr>
+          <w:left w:val="single" w:color="cccccc" w:sz="12" w:space="8"/>
+        </w:pBdr>
+        <w:spacing w:after="120"/>
+        <w:ind w:left="400"/>
+      </w:pPr>
+      <w:r>
+        <w:rPr>
+          <w:i/>
+          <w:iCs/>
+          <w:color w:val="333333"/>
+          <w:sz w:val="20"/>
+          <w:szCs w:val="20"/>
+        </w:rPr>
+        <w:t xml:space="preserve">Você é dono de imobiliária ou administradora em Porto Alegre ou Canoas?</w:t>
+      </w:r>
+    </w:p>
+    <w:p>
+      <w:pPr>
+        <w:spacing w:after="160"/>
+      </w:pPr>
+      <w:r>
+        <w:rPr>
+          <w:sz w:val="21"/>
+          <w:szCs w:val="21"/>
+        </w:rPr>
+        <w:t xml:space="preserve">&gt;</w:t>
+      </w:r>
+    </w:p>
+    <w:p>
+      <w:pPr>
+        <w:pBdr>
+          <w:left w:val="single" w:color="cccccc" w:sz="12" w:space="8"/>
+        </w:pBdr>
+        <w:spacing w:after="120"/>
+        <w:ind w:left="400"/>
+      </w:pPr>
+      <w:r>
+        <w:rPr>
+          <w:i/>
+          <w:iCs/>
+          <w:color w:val="333333"/>
+          <w:sz w:val="20"/>
+          <w:szCs w:val="20"/>
+        </w:rPr>
+        <w:t xml:space="preserve">A Eleva está adquirindo empresas e carteiras de aluguéis e condomínios na região, negociação direta com Giuliano Spolavori: +35 anos no mercado imobiliário, +2.200 condomínios geridos, +20 operações de M&amp;A, +8 mil imóveis locados.</w:t>
+      </w:r>
+    </w:p>
+    <w:p>
+      <w:pPr>
+        <w:spacing w:after="160"/>
+      </w:pPr>
+      <w:r>
+        <w:rPr>
+          <w:sz w:val="21"/>
+          <w:szCs w:val="21"/>
+        </w:rPr>
+        <w:t xml:space="preserve">&gt;</w:t>
+      </w:r>
+    </w:p>
+    <w:p>
+      <w:pPr>
+        <w:pBdr>
+          <w:left w:val="single" w:color="cccccc" w:sz="12" w:space="8"/>
+        </w:pBdr>
+        <w:spacing w:after="120"/>
+        <w:ind w:left="400"/>
+      </w:pPr>
+      <w:r>
+        <w:rPr>
+          <w:i/>
+          <w:iCs/>
+          <w:color w:val="333333"/>
+          <w:sz w:val="20"/>
+          <w:szCs w:val="20"/>
+        </w:rPr>
+        <w:t xml:space="preserve">Se interessou e quer saber como funciona?</w:t>
+      </w:r>
+    </w:p>
+    <w:p>
+      <w:pPr>
+        <w:pBdr>
+          <w:left w:val="single" w:color="cccccc" w:sz="12" w:space="8"/>
+        </w:pBdr>
+        <w:spacing w:after="120"/>
+        <w:ind w:left="400"/>
+      </w:pPr>
+      <w:r>
+        <w:rPr>
+          <w:i/>
+          <w:iCs/>
+          <w:color w:val="333333"/>
+          <w:sz w:val="20"/>
+          <w:szCs w:val="20"/>
+        </w:rPr>
+        <w:t xml:space="preserve">Toque no botão abaixo para conversar conosco através do WhatsApp.</w:t>
+      </w:r>
+    </w:p>
+    <w:p>
+      <w:pPr>
+        <w:spacing w:after="160"/>
+      </w:pPr>
+      <w:r>
+        <w:rPr>
+          <w:b/>
+          <w:bCs/>
+          <w:sz w:val="21"/>
+          <w:szCs w:val="21"/>
+        </w:rPr>
+        <w:t xml:space="preserve">Botão do anúncio:</w:t>
+      </w:r>
+      <w:r>
+        <w:rPr>
+          <w:sz w:val="21"/>
+          <w:szCs w:val="21"/>
+        </w:rPr>
+        <w:t xml:space="preserve"> Fale conosco</w:t>
+      </w:r>
+    </w:p>
+    <w:p>
+      <w:pPr>
+        <w:pStyle w:val="Heading2"/>
+        <w:spacing w:after="150" w:before="300"/>
+      </w:pPr>
+      <w:r>
+        <w:t xml:space="preserve">8. Riscos e observações</w:t>
+      </w:r>
+    </w:p>
+    <w:p>
+      <w:pPr>
+        <w:pStyle w:val="ListParagraph"/>
+        <w:numPr>
+          <w:ilvl w:val="0"/>
+          <w:numId w:val="1"/>
+        </w:numPr>
+        <w:spacing w:after="80"/>
+      </w:pPr>
+      <w:r>
+        <w:rPr>
+          <w:b/>
+          <w:bCs/>
+          <w:sz w:val="21"/>
+          <w:szCs w:val="21"/>
+        </w:rPr>
+        <w:t xml:space="preserve">Público pequeno pode saturar rápido:</w:t>
+      </w:r>
+      <w:r>
+        <w:rPr>
+          <w:sz w:val="21"/>
+          <w:szCs w:val="21"/>
+        </w:rPr>
+        <w:t xml:space="preserve"> com frequência estimada de até 2,5 em 15 dias, vale monitorar se a mesma pessoa está vendo o anúncio repetidamente sem agir — sinal de já ter esgotado o público qualificado da região.</w:t>
+      </w:r>
+    </w:p>
+    <w:p>
+      <w:pPr>
+        <w:pStyle w:val="ListParagraph"/>
+        <w:numPr>
+          <w:ilvl w:val="0"/>
+          <w:numId w:val="1"/>
+        </w:numPr>
+        <w:spacing w:after="80"/>
+      </w:pPr>
+      <w:r>
+        <w:rPr>
+          <w:b/>
+          <w:bCs/>
+          <w:sz w:val="21"/>
+          <w:szCs w:val="21"/>
+        </w:rPr>
+        <w:t xml:space="preserve">Sem dado histórico é um risco assumido conscientemente:</w:t>
+      </w:r>
+      <w:r>
+        <w:rPr>
+          <w:sz w:val="21"/>
+          <w:szCs w:val="21"/>
+        </w:rPr>
+        <w:t xml:space="preserve"> os criativos já tiveram resultado em outro contexto/BM, mas isso não garante repetição de performance — pode ser público, período ou plataforma diferentes. Os 15 dias servem exatamente pra validar isso aqui, com esse público restrito.</w:t>
+      </w:r>
+    </w:p>
+    <w:p>
+      <w:pPr>
+        <w:pStyle w:val="ListParagraph"/>
+        <w:numPr>
+          <w:ilvl w:val="0"/>
+          <w:numId w:val="1"/>
+        </w:numPr>
+        <w:spacing w:after="80"/>
+      </w:pPr>
+      <w:r>
+        <w:rPr>
+          <w:b/>
+          <w:bCs/>
+          <w:sz w:val="21"/>
+          <w:szCs w:val="21"/>
+        </w:rPr>
+        <w:t xml:space="preserve">Qualidade da conversa importa mais que quantidade:</w:t>
+      </w:r>
+      <w:r>
+        <w:rPr>
+          <w:sz w:val="21"/>
+          <w:szCs w:val="21"/>
+        </w:rPr>
+        <w:t xml:space="preserve"> dado o nicho ser tão específico (só quem realmente tem carteira pra vender), vale orientar quem for atender o WhatsApp a documentar rapidamente se cada conversa é "lead real" ou "curioso", pra conseguirmos calcular a taxa de conversão de verdade depois dos 15 dias.</w:t>
+      </w:r>
+    </w:p>
+    <w:p>
+      <w:pPr>
+        <w:pStyle w:val="ListParagraph"/>
+        <w:numPr>
+          <w:ilvl w:val="0"/>
+          <w:numId w:val="1"/>
+        </w:numPr>
+        <w:spacing w:after="80"/>
+      </w:pPr>
+      <w:r>
+        <w:rPr>
+          <w:b/>
+          <w:bCs/>
+          <w:sz w:val="21"/>
+          <w:szCs w:val="21"/>
+        </w:rPr>
         <w:t xml:space="preserve">Levantamento de imobiliárias é uma foto do momento:</w:t>
       </w:r>
       <w:r>
@@ -2393,7 +3044,7 @@
           <w:sz w:val="21"/>
           <w:szCs w:val="21"/>
         </w:rPr>
-        <w:t xml:space="preserve">2. Subir a campanha com a estrutura da seção 2, usando os 5 pins da seção 3.</w:t>
+        <w:t xml:space="preserve">2. Subir a campanha com a estrutura da seção 2, usando os pins da seção 3.</w:t>
       </w:r>
     </w:p>
     <w:p>

</xml_diff>

<commit_message>
Confirma bairro das 8 empresas pendentes e fecha cobertura de pins
Com os prints do Google, 6 das 8 empresas caem dentro dos clusters já
existentes (Centro ganha o bairro Auxiliadora); sobram só 2 isoladas
de verdade (São Sebastião e Nonoai). Total: 5 clusters + 8 pins
individuais = 13 pins cobrindo as 63 empresas do levantamento.

Co-Authored-By: Claude Sonnet 5 <noreply@anthropic.com>
Claude-Session: https://claude.ai/code/session_01GQSqEjEuqv44iBdACeUWUZ
</commit_message>
<xml_diff>
--- a/eleva/analise-campanha-compra-carteiras-imobiliarias.docx
+++ b/eleva/analise-campanha-compra-carteiras-imobiliarias.docx
@@ -602,24 +602,24 @@
                 <w:sz w:val="19"/>
                 <w:szCs w:val="19"/>
               </w:rPr>
-              <w:t xml:space="preserve">12 diretas + cobre a maioria das demais</w:t>
-            </w:r>
-          </w:p>
-        </w:tc>
-        <w:tc>
-          <w:tcPr>
-            <w:tcW w:type="dxa" w:w="2256"/>
-          </w:tcPr>
-          <w:p>
-            <w:r>
-              <w:rPr>
-                <w:b w:val="false"/>
-                <w:bCs w:val="false"/>
-                <w:color w:val="000000"/>
-                <w:sz w:val="19"/>
-                <w:szCs w:val="19"/>
-              </w:rPr>
-              <w:t xml:space="preserve">Centro, Centro Histórico, Bom Fim, Farroupilha, Independência, Azenha, Moinhos de Vento, Floresta, Mont'Serrat, Menino Deus, Bela Vista, Rio Branco</w:t>
+              <w:t xml:space="preserve">17 diretas + cobre a maioria das demais</w:t>
+            </w:r>
+          </w:p>
+        </w:tc>
+        <w:tc>
+          <w:tcPr>
+            <w:tcW w:type="dxa" w:w="2256"/>
+          </w:tcPr>
+          <w:p>
+            <w:r>
+              <w:rPr>
+                <w:b w:val="false"/>
+                <w:bCs w:val="false"/>
+                <w:color w:val="000000"/>
+                <w:sz w:val="19"/>
+                <w:szCs w:val="19"/>
+              </w:rPr>
+              <w:t xml:space="preserve">Centro, Centro Histórico, Bom Fim, Farroupilha, Independência, Azenha, Moinhos de Vento, Floresta, Auxiliadora, Mont'Serrat, Menino Deus, Bela Vista, Rio Branco</w:t>
             </w:r>
           </w:p>
         </w:tc>
@@ -672,7 +672,7 @@
                 <w:sz w:val="19"/>
                 <w:szCs w:val="19"/>
               </w:rPr>
-              <w:t xml:space="preserve">5</w:t>
+              <w:t xml:space="preserve">6</w:t>
             </w:r>
           </w:p>
         </w:tc>
@@ -981,14 +981,14 @@
           <w:sz w:val="21"/>
           <w:szCs w:val="21"/>
         </w:rPr>
-        <w:t xml:space="preserve">Cobertura pelos 5 clusters:</w:t>
-      </w:r>
-      <w:r>
-        <w:rPr>
-          <w:sz w:val="21"/>
-          <w:szCs w:val="21"/>
-        </w:rPr>
-        <w:t xml:space="preserve"> ~55 das 63 empresas listadas.</w:t>
+        <w:t xml:space="preserve">Cobertura pelos 3 clusters de Porto Alegre + 2 de Canoas:</w:t>
+      </w:r>
+      <w:r>
+        <w:rPr>
+          <w:sz w:val="21"/>
+          <w:szCs w:val="21"/>
+        </w:rPr>
+        <w:t xml:space="preserve"> ~61 das 63 empresas listadas, após confirmar o bairro das 8 que estavam sem essa informação na planilha original (a maioria caiu dentro dos clusters já existentes, só 1 exigiu ajuste no raio do cluster Centro pra incluir o bairro Auxiliadora).</w:t>
       </w:r>
     </w:p>
     <w:p>
@@ -1002,7 +1002,7 @@
           <w:sz w:val="21"/>
           <w:szCs w:val="21"/>
         </w:rPr>
-        <w:t xml:space="preserve">Pins individuais adicionais (empresas fora dos 5 clusters):</w:t>
+        <w:t xml:space="preserve">Pins individuais adicionais (empresas fora dos clusters):</w:t>
       </w:r>
       <w:r>
         <w:rPr>
@@ -1188,7 +1188,7 @@
                 <w:sz w:val="19"/>
                 <w:szCs w:val="19"/>
               </w:rPr>
-              <w:t xml:space="preserve">Innove Imóveis e Seguros</w:t>
+              <w:t xml:space="preserve">A Diretriz Adm. de Imóveis e Condomínios</w:t>
             </w:r>
           </w:p>
         </w:tc>
@@ -1222,24 +1222,24 @@
                 <w:sz w:val="19"/>
                 <w:szCs w:val="19"/>
               </w:rPr>
-              <w:t xml:space="preserve">Av. Bento Gonçalves</w:t>
-            </w:r>
-          </w:p>
-        </w:tc>
-        <w:tc>
-          <w:tcPr>
-            <w:tcW w:type="dxa" w:w="2256"/>
-          </w:tcPr>
-          <w:p>
-            <w:r>
-              <w:rPr>
-                <w:b w:val="false"/>
-                <w:bCs w:val="false"/>
-                <w:color w:val="000000"/>
-                <w:sz w:val="19"/>
-                <w:szCs w:val="19"/>
-              </w:rPr>
-              <w:t xml:space="preserve">Partenon</w:t>
+              <w:t xml:space="preserve">R. Joaquim Silveira, 396</w:t>
+            </w:r>
+          </w:p>
+        </w:tc>
+        <w:tc>
+          <w:tcPr>
+            <w:tcW w:type="dxa" w:w="2256"/>
+          </w:tcPr>
+          <w:p>
+            <w:r>
+              <w:rPr>
+                <w:b w:val="false"/>
+                <w:bCs w:val="false"/>
+                <w:color w:val="000000"/>
+                <w:sz w:val="19"/>
+                <w:szCs w:val="19"/>
+              </w:rPr>
+              <w:t xml:space="preserve">São Sebastião (mesmo pin do Alfa City)</w:t>
             </w:r>
           </w:p>
         </w:tc>
@@ -1258,7 +1258,7 @@
                 <w:sz w:val="19"/>
                 <w:szCs w:val="19"/>
               </w:rPr>
-              <w:t xml:space="preserve">Imobiliária Farrapos</w:t>
+              <w:t xml:space="preserve">Administradora Rio Grandense</w:t>
             </w:r>
           </w:p>
         </w:tc>
@@ -1292,24 +1292,24 @@
                 <w:sz w:val="19"/>
                 <w:szCs w:val="19"/>
               </w:rPr>
-              <w:t xml:space="preserve">Rua Conde de Porto Alegre</w:t>
-            </w:r>
-          </w:p>
-        </w:tc>
-        <w:tc>
-          <w:tcPr>
-            <w:tcW w:type="dxa" w:w="2256"/>
-          </w:tcPr>
-          <w:p>
-            <w:r>
-              <w:rPr>
-                <w:b w:val="false"/>
-                <w:bCs w:val="false"/>
-                <w:color w:val="000000"/>
-                <w:sz w:val="19"/>
-                <w:szCs w:val="19"/>
-              </w:rPr>
-              <w:t xml:space="preserve">Navegantes</w:t>
+              <w:t xml:space="preserve">R. Santa Flora, 1482</w:t>
+            </w:r>
+          </w:p>
+        </w:tc>
+        <w:tc>
+          <w:tcPr>
+            <w:tcW w:type="dxa" w:w="2256"/>
+          </w:tcPr>
+          <w:p>
+            <w:r>
+              <w:rPr>
+                <w:b w:val="false"/>
+                <w:bCs w:val="false"/>
+                <w:color w:val="000000"/>
+                <w:sz w:val="19"/>
+                <w:szCs w:val="19"/>
+              </w:rPr>
+              <w:t xml:space="preserve">Nonoai</w:t>
             </w:r>
           </w:p>
         </w:tc>
@@ -1328,7 +1328,7 @@
                 <w:sz w:val="19"/>
                 <w:szCs w:val="19"/>
               </w:rPr>
-              <w:t xml:space="preserve">Talla Adm. de Condomínios</w:t>
+              <w:t xml:space="preserve">Innove Imóveis e Seguros</w:t>
             </w:r>
           </w:p>
         </w:tc>
@@ -1362,24 +1362,24 @@
                 <w:sz w:val="19"/>
                 <w:szCs w:val="19"/>
               </w:rPr>
-              <w:t xml:space="preserve">Av. Protásio Alves, 1880</w:t>
-            </w:r>
-          </w:p>
-        </w:tc>
-        <w:tc>
-          <w:tcPr>
-            <w:tcW w:type="dxa" w:w="2256"/>
-          </w:tcPr>
-          <w:p>
-            <w:r>
-              <w:rPr>
-                <w:b w:val="false"/>
-                <w:bCs w:val="false"/>
-                <w:color w:val="000000"/>
-                <w:sz w:val="19"/>
-                <w:szCs w:val="19"/>
-              </w:rPr>
-              <w:t xml:space="preserve">Petrópolis</w:t>
+              <w:t xml:space="preserve">Av. Bento Gonçalves</w:t>
+            </w:r>
+          </w:p>
+        </w:tc>
+        <w:tc>
+          <w:tcPr>
+            <w:tcW w:type="dxa" w:w="2256"/>
+          </w:tcPr>
+          <w:p>
+            <w:r>
+              <w:rPr>
+                <w:b w:val="false"/>
+                <w:bCs w:val="false"/>
+                <w:color w:val="000000"/>
+                <w:sz w:val="19"/>
+                <w:szCs w:val="19"/>
+              </w:rPr>
+              <w:t xml:space="preserve">Partenon</w:t>
             </w:r>
           </w:p>
         </w:tc>
@@ -1398,58 +1398,58 @@
                 <w:sz w:val="19"/>
                 <w:szCs w:val="19"/>
               </w:rPr>
-              <w:t xml:space="preserve">Inovar Gestão Imobiliária</w:t>
-            </w:r>
-          </w:p>
-        </w:tc>
-        <w:tc>
-          <w:tcPr>
-            <w:tcW w:type="dxa" w:w="2256"/>
-          </w:tcPr>
-          <w:p>
-            <w:r>
-              <w:rPr>
-                <w:b w:val="false"/>
-                <w:bCs w:val="false"/>
-                <w:color w:val="000000"/>
-                <w:sz w:val="19"/>
-                <w:szCs w:val="19"/>
-              </w:rPr>
-              <w:t xml:space="preserve">Canoas</w:t>
-            </w:r>
-          </w:p>
-        </w:tc>
-        <w:tc>
-          <w:tcPr>
-            <w:tcW w:type="dxa" w:w="2256"/>
-          </w:tcPr>
-          <w:p>
-            <w:r>
-              <w:rPr>
-                <w:b w:val="false"/>
-                <w:bCs w:val="false"/>
-                <w:color w:val="000000"/>
-                <w:sz w:val="19"/>
-                <w:szCs w:val="19"/>
-              </w:rPr>
-              <w:t xml:space="preserve">Rua Lajeado, 1621</w:t>
-            </w:r>
-          </w:p>
-        </w:tc>
-        <w:tc>
-          <w:tcPr>
-            <w:tcW w:type="dxa" w:w="2256"/>
-          </w:tcPr>
-          <w:p>
-            <w:r>
-              <w:rPr>
-                <w:b w:val="false"/>
-                <w:bCs w:val="false"/>
-                <w:color w:val="000000"/>
-                <w:sz w:val="19"/>
-                <w:szCs w:val="19"/>
-              </w:rPr>
-              <w:t xml:space="preserve">Niterói</w:t>
+              <w:t xml:space="preserve">Imobiliária Farrapos</w:t>
+            </w:r>
+          </w:p>
+        </w:tc>
+        <w:tc>
+          <w:tcPr>
+            <w:tcW w:type="dxa" w:w="2256"/>
+          </w:tcPr>
+          <w:p>
+            <w:r>
+              <w:rPr>
+                <w:b w:val="false"/>
+                <w:bCs w:val="false"/>
+                <w:color w:val="000000"/>
+                <w:sz w:val="19"/>
+                <w:szCs w:val="19"/>
+              </w:rPr>
+              <w:t xml:space="preserve">Porto Alegre</w:t>
+            </w:r>
+          </w:p>
+        </w:tc>
+        <w:tc>
+          <w:tcPr>
+            <w:tcW w:type="dxa" w:w="2256"/>
+          </w:tcPr>
+          <w:p>
+            <w:r>
+              <w:rPr>
+                <w:b w:val="false"/>
+                <w:bCs w:val="false"/>
+                <w:color w:val="000000"/>
+                <w:sz w:val="19"/>
+                <w:szCs w:val="19"/>
+              </w:rPr>
+              <w:t xml:space="preserve">Rua Conde de Porto Alegre</w:t>
+            </w:r>
+          </w:p>
+        </w:tc>
+        <w:tc>
+          <w:tcPr>
+            <w:tcW w:type="dxa" w:w="2256"/>
+          </w:tcPr>
+          <w:p>
+            <w:r>
+              <w:rPr>
+                <w:b w:val="false"/>
+                <w:bCs w:val="false"/>
+                <w:color w:val="000000"/>
+                <w:sz w:val="19"/>
+                <w:szCs w:val="19"/>
+              </w:rPr>
+              <w:t xml:space="preserve">Navegantes</w:t>
             </w:r>
           </w:p>
         </w:tc>
@@ -1468,58 +1468,58 @@
                 <w:sz w:val="19"/>
                 <w:szCs w:val="19"/>
               </w:rPr>
-              <w:t xml:space="preserve">R2 Síndicos Profissionais</w:t>
-            </w:r>
-          </w:p>
-        </w:tc>
-        <w:tc>
-          <w:tcPr>
-            <w:tcW w:type="dxa" w:w="2256"/>
-          </w:tcPr>
-          <w:p>
-            <w:r>
-              <w:rPr>
-                <w:b w:val="false"/>
-                <w:bCs w:val="false"/>
-                <w:color w:val="000000"/>
-                <w:sz w:val="19"/>
-                <w:szCs w:val="19"/>
-              </w:rPr>
-              <w:t xml:space="preserve">Canoas</w:t>
-            </w:r>
-          </w:p>
-        </w:tc>
-        <w:tc>
-          <w:tcPr>
-            <w:tcW w:type="dxa" w:w="2256"/>
-          </w:tcPr>
-          <w:p>
-            <w:r>
-              <w:rPr>
-                <w:b w:val="false"/>
-                <w:bCs w:val="false"/>
-                <w:color w:val="000000"/>
-                <w:sz w:val="19"/>
-                <w:szCs w:val="19"/>
-              </w:rPr>
-              <w:t xml:space="preserve">Rua Paes Lemes, 715 Sl 01</w:t>
-            </w:r>
-          </w:p>
-        </w:tc>
-        <w:tc>
-          <w:tcPr>
-            <w:tcW w:type="dxa" w:w="2256"/>
-          </w:tcPr>
-          <w:p>
-            <w:r>
-              <w:rPr>
-                <w:b w:val="false"/>
-                <w:bCs w:val="false"/>
-                <w:color w:val="000000"/>
-                <w:sz w:val="19"/>
-                <w:szCs w:val="19"/>
-              </w:rPr>
-              <w:t xml:space="preserve">Rio Branco (Canoas)</w:t>
+              <w:t xml:space="preserve">Talla Adm. de Condomínios</w:t>
+            </w:r>
+          </w:p>
+        </w:tc>
+        <w:tc>
+          <w:tcPr>
+            <w:tcW w:type="dxa" w:w="2256"/>
+          </w:tcPr>
+          <w:p>
+            <w:r>
+              <w:rPr>
+                <w:b w:val="false"/>
+                <w:bCs w:val="false"/>
+                <w:color w:val="000000"/>
+                <w:sz w:val="19"/>
+                <w:szCs w:val="19"/>
+              </w:rPr>
+              <w:t xml:space="preserve">Porto Alegre</w:t>
+            </w:r>
+          </w:p>
+        </w:tc>
+        <w:tc>
+          <w:tcPr>
+            <w:tcW w:type="dxa" w:w="2256"/>
+          </w:tcPr>
+          <w:p>
+            <w:r>
+              <w:rPr>
+                <w:b w:val="false"/>
+                <w:bCs w:val="false"/>
+                <w:color w:val="000000"/>
+                <w:sz w:val="19"/>
+                <w:szCs w:val="19"/>
+              </w:rPr>
+              <w:t xml:space="preserve">Av. Protásio Alves, 1880</w:t>
+            </w:r>
+          </w:p>
+        </w:tc>
+        <w:tc>
+          <w:tcPr>
+            <w:tcW w:type="dxa" w:w="2256"/>
+          </w:tcPr>
+          <w:p>
+            <w:r>
+              <w:rPr>
+                <w:b w:val="false"/>
+                <w:bCs w:val="false"/>
+                <w:color w:val="000000"/>
+                <w:sz w:val="19"/>
+                <w:szCs w:val="19"/>
+              </w:rPr>
+              <w:t xml:space="preserve">Petrópolis</w:t>
             </w:r>
           </w:p>
         </w:tc>
@@ -1538,6 +1538,146 @@
                 <w:sz w:val="19"/>
                 <w:szCs w:val="19"/>
               </w:rPr>
+              <w:t xml:space="preserve">Inovar Gestão Imobiliária</w:t>
+            </w:r>
+          </w:p>
+        </w:tc>
+        <w:tc>
+          <w:tcPr>
+            <w:tcW w:type="dxa" w:w="2256"/>
+          </w:tcPr>
+          <w:p>
+            <w:r>
+              <w:rPr>
+                <w:b w:val="false"/>
+                <w:bCs w:val="false"/>
+                <w:color w:val="000000"/>
+                <w:sz w:val="19"/>
+                <w:szCs w:val="19"/>
+              </w:rPr>
+              <w:t xml:space="preserve">Canoas</w:t>
+            </w:r>
+          </w:p>
+        </w:tc>
+        <w:tc>
+          <w:tcPr>
+            <w:tcW w:type="dxa" w:w="2256"/>
+          </w:tcPr>
+          <w:p>
+            <w:r>
+              <w:rPr>
+                <w:b w:val="false"/>
+                <w:bCs w:val="false"/>
+                <w:color w:val="000000"/>
+                <w:sz w:val="19"/>
+                <w:szCs w:val="19"/>
+              </w:rPr>
+              <w:t xml:space="preserve">Rua Lajeado, 1621</w:t>
+            </w:r>
+          </w:p>
+        </w:tc>
+        <w:tc>
+          <w:tcPr>
+            <w:tcW w:type="dxa" w:w="2256"/>
+          </w:tcPr>
+          <w:p>
+            <w:r>
+              <w:rPr>
+                <w:b w:val="false"/>
+                <w:bCs w:val="false"/>
+                <w:color w:val="000000"/>
+                <w:sz w:val="19"/>
+                <w:szCs w:val="19"/>
+              </w:rPr>
+              <w:t xml:space="preserve">Niterói</w:t>
+            </w:r>
+          </w:p>
+        </w:tc>
+      </w:tr>
+      <w:tr>
+        <w:tc>
+          <w:tcPr>
+            <w:tcW w:type="dxa" w:w="2256"/>
+          </w:tcPr>
+          <w:p>
+            <w:r>
+              <w:rPr>
+                <w:b w:val="false"/>
+                <w:bCs w:val="false"/>
+                <w:color w:val="000000"/>
+                <w:sz w:val="19"/>
+                <w:szCs w:val="19"/>
+              </w:rPr>
+              <w:t xml:space="preserve">R2 Síndicos Profissionais</w:t>
+            </w:r>
+          </w:p>
+        </w:tc>
+        <w:tc>
+          <w:tcPr>
+            <w:tcW w:type="dxa" w:w="2256"/>
+          </w:tcPr>
+          <w:p>
+            <w:r>
+              <w:rPr>
+                <w:b w:val="false"/>
+                <w:bCs w:val="false"/>
+                <w:color w:val="000000"/>
+                <w:sz w:val="19"/>
+                <w:szCs w:val="19"/>
+              </w:rPr>
+              <w:t xml:space="preserve">Canoas</w:t>
+            </w:r>
+          </w:p>
+        </w:tc>
+        <w:tc>
+          <w:tcPr>
+            <w:tcW w:type="dxa" w:w="2256"/>
+          </w:tcPr>
+          <w:p>
+            <w:r>
+              <w:rPr>
+                <w:b w:val="false"/>
+                <w:bCs w:val="false"/>
+                <w:color w:val="000000"/>
+                <w:sz w:val="19"/>
+                <w:szCs w:val="19"/>
+              </w:rPr>
+              <w:t xml:space="preserve">Rua Paes Lemes, 715 Sl 01</w:t>
+            </w:r>
+          </w:p>
+        </w:tc>
+        <w:tc>
+          <w:tcPr>
+            <w:tcW w:type="dxa" w:w="2256"/>
+          </w:tcPr>
+          <w:p>
+            <w:r>
+              <w:rPr>
+                <w:b w:val="false"/>
+                <w:bCs w:val="false"/>
+                <w:color w:val="000000"/>
+                <w:sz w:val="19"/>
+                <w:szCs w:val="19"/>
+              </w:rPr>
+              <w:t xml:space="preserve">Rio Branco (Canoas)</w:t>
+            </w:r>
+          </w:p>
+        </w:tc>
+      </w:tr>
+      <w:tr>
+        <w:tc>
+          <w:tcPr>
+            <w:tcW w:type="dxa" w:w="2256"/>
+          </w:tcPr>
+          <w:p>
+            <w:r>
+              <w:rPr>
+                <w:b w:val="false"/>
+                <w:bCs w:val="false"/>
+                <w:color w:val="000000"/>
+                <w:sz w:val="19"/>
+                <w:szCs w:val="19"/>
+              </w:rPr>
               <w:t xml:space="preserve">Da Vinci Gestão Imobiliária</w:t>
             </w:r>
           </w:p>
@@ -1611,27 +1751,6 @@
           <w:sz w:val="21"/>
           <w:szCs w:val="21"/>
         </w:rPr>
-        <w:t xml:space="preserve">Atenção — 8 empresas da planilha sem bairro identificado:</w:t>
-      </w:r>
-      <w:r>
-        <w:rPr>
-          <w:sz w:val="21"/>
-          <w:szCs w:val="21"/>
-        </w:rPr>
-        <w:t xml:space="preserve"> 3R Administração Imobiliária, A Diretriz Imóveis, Imobiliária Acemil, Adacon Imóveis, Administradora Rio Grandense, Afreis Gestão Condominial, Cohen Imóveis e Imobiliária Exame têm só rua/CEP na planilha, sem bairro confirmado (não temos acesso a mapa neste ambiente pra confirmar a localização com segurança). Antes de criar o pin dessas, vale conferir o endereço completo num mapa (Google Maps) — não quis arriscar posicionar errado.</w:t>
-      </w:r>
-    </w:p>
-    <w:p>
-      <w:pPr>
-        <w:spacing w:after="160"/>
-      </w:pPr>
-      <w:r>
-        <w:rPr>
-          <w:b/>
-          <w:bCs/>
-          <w:sz w:val="21"/>
-          <w:szCs w:val="21"/>
-        </w:rPr>
         <w:t xml:space="preserve">Total de pins no conjunto de anúncios:</w:t>
       </w:r>
       <w:r>
@@ -1639,7 +1758,7 @@
           <w:sz w:val="21"/>
           <w:szCs w:val="21"/>
         </w:rPr>
-        <w:t xml:space="preserve"> 5 clusters + 7 pins individuais = 12 pins (mais os das 8 empresas pendentes de confirmação, se quiser incluir depois de checar o endereço).</w:t>
+        <w:t xml:space="preserve"> 5 clusters + 8 pins individuais (o de São Sebastião cobre 2 empresas) = 13 pins, cobrindo as 63 empresas do levantamento.</w:t>
       </w:r>
     </w:p>
     <w:p>

</xml_diff>

<commit_message>
Adiciona proposta de squeeze page para compra de carteiras: mockup, prompt para o Webflow, carrossel e roteiro de vídeo revisado
Co-Authored-By: Claude Sonnet 5 <noreply@anthropic.com>
Claude-Session: https://claude.ai/code/session_01GQSqEjEuqv44iBdACeUWUZ
</commit_message>
<xml_diff>
--- a/eleva/analise-campanha-compra-carteiras-imobiliarias.docx
+++ b/eleva/analise-campanha-compra-carteiras-imobiliarias.docx
@@ -50,6 +50,7 @@
     <w:p>
       <w:pPr>
         <w:pStyle w:val="Heading2"/>
+        <w:keepNext/>
         <w:spacing w:after="150" w:before="300"/>
       </w:pPr>
       <w:r>
@@ -159,6 +160,7 @@
     <w:p>
       <w:pPr>
         <w:pStyle w:val="Heading2"/>
+        <w:keepNext/>
         <w:spacing w:after="150" w:before="300"/>
       </w:pPr>
       <w:r>
@@ -413,6 +415,7 @@
     <w:p>
       <w:pPr>
         <w:pStyle w:val="Heading2"/>
+        <w:keepNext/>
         <w:spacing w:after="150" w:before="300"/>
       </w:pPr>
       <w:r>
@@ -1785,6 +1788,7 @@
     <w:p>
       <w:pPr>
         <w:pStyle w:val="Heading2"/>
+        <w:keepNext/>
         <w:spacing w:after="150" w:before="300"/>
       </w:pPr>
       <w:r>
@@ -1987,6 +1991,7 @@
     <w:p>
       <w:pPr>
         <w:pStyle w:val="Heading2"/>
+        <w:keepNext/>
         <w:spacing w:after="150" w:before="300"/>
       </w:pPr>
       <w:r>
@@ -2100,6 +2105,7 @@
     <w:p>
       <w:pPr>
         <w:pStyle w:val="Heading2"/>
+        <w:keepNext/>
         <w:spacing w:after="150" w:before="300"/>
       </w:pPr>
       <w:r>
@@ -2840,6 +2846,7 @@
     <w:p>
       <w:pPr>
         <w:pStyle w:val="Heading2"/>
+        <w:keepNext/>
         <w:spacing w:after="150" w:before="300"/>
       </w:pPr>
       <w:r>
@@ -3013,6 +3020,7 @@
     <w:p>
       <w:pPr>
         <w:pStyle w:val="Heading2"/>
+        <w:keepNext/>
         <w:spacing w:after="150" w:before="300"/>
       </w:pPr>
       <w:r>
@@ -3126,6 +3134,7 @@
     <w:p>
       <w:pPr>
         <w:pStyle w:val="Heading2"/>
+        <w:keepNext/>
         <w:spacing w:after="150" w:before="300"/>
       </w:pPr>
       <w:r>
@@ -3198,6 +3207,28 @@
           <w:szCs w:val="21"/>
         </w:rPr>
         <w:t xml:space="preserve">4. Ao final, comparar resultado real com os 3 cenários da seção 6, e decidir sobre aumento de verba com base em custo por conversa qualificada, não só custo por conversa iniciada.</w:t>
+      </w:r>
+    </w:p>
+    <w:p>
+      <w:pPr>
+        <w:pStyle w:val="Heading2"/>
+        <w:keepNext/>
+        <w:spacing w:after="150" w:before="300"/>
+      </w:pPr>
+      <w:r>
+        <w:t xml:space="preserve">10. Atualização — squeeze page de qualificação</w:t>
+      </w:r>
+    </w:p>
+    <w:p>
+      <w:pPr>
+        <w:spacing w:after="160"/>
+      </w:pPr>
+      <w:r>
+        <w:rPr>
+          <w:sz w:val="21"/>
+          <w:szCs w:val="21"/>
+        </w:rPr>
+        <w:t xml:space="preserve">Os primeiros 5 dias de veiculação confirmaram o risco apontado na seção 8: levar o clique direto para o WhatsApp, sem nenhuma etapa de qualificação, não filtra quem é curioso de quem realmente é dono ou decisor de imobiliária/administradora. Em outro documento paralelo, que a Amanda vai enviar, está o mockup e a proposta de squeeze page para receber esse público antes de liberar a conversa com o Giuliano (arquivo `squeeze-page-compra-carteiras-imobiliarias.md`, com docx e pdf).</w:t>
       </w:r>
     </w:p>
     <w:sectPr>

</xml_diff>